<commit_message>
Hasil terkunci hasil-skripsi-v5 (final): K utama 4, status TAS 2 berganti nama, lembar validasi TAS
Analisis pada commit 0bcb860, dijalankan dua kali tanpa jeda dengan fingerprint identik
(8b0b47ee...e0dc). Isi CSV grid dan data gabungan identik dengan v4 (hanya penyajian yang berubah).
output_bab4/: tabel T/L/S (K utama 4), temuan_kunci.md, perbandingan_v4_vs_v5.md, peta,
validasi/validasi_TAS.xlsx (253 baris) + peta per TAS.

Co-Authored-By: Claude Opus 5.5 <noreply@anthropic.com>
</commit_message>
<xml_diff>
--- a/output_bab4/Tabel_Bab4.docx
+++ b/output_bab4/Tabel_Bab4.docx
@@ -12,7 +12,7 @@
     </w:p>
     <w:p>
       <w:r>
-        <w:t>Sumber: data/locked/ (commit analisis 01fe65b286, dikunci 2026-09-25T02:26:04+07:00). K utama = 4; tabel berawalan S = sensitivitas K lain; L = lampiran. Format angka Indonesia; waktu 2 desimal, metrik 3 desimal.</w:t>
+        <w:t>Sumber: data/locked/ (commit analisis 0bcb860004, dikunci 2026-09-25T03:00:41+07:00). K utama = 4; tabel berawalan S = sensitivitas K lain; L = lampiran. Format angka Indonesia; waktu 2 desimal, metrik 3 desimal.</w:t>
       </w:r>
     </w:p>
     <w:p>
@@ -3718,28 +3718,29 @@
         <w:tblLook w:firstColumn="1" w:firstRow="1" w:lastColumn="0" w:lastRow="0" w:noHBand="0" w:noVBand="1" w:val="04A0"/>
       </w:tblPr>
       <w:tblGrid>
-        <w:gridCol w:w="832"/>
-        <w:gridCol w:w="832"/>
-        <w:gridCol w:w="832"/>
-        <w:gridCol w:w="832"/>
-        <w:gridCol w:w="832"/>
-        <w:gridCol w:w="832"/>
-        <w:gridCol w:w="832"/>
-        <w:gridCol w:w="832"/>
-        <w:gridCol w:w="832"/>
-        <w:gridCol w:w="832"/>
-        <w:gridCol w:w="832"/>
-        <w:gridCol w:w="832"/>
-        <w:gridCol w:w="832"/>
-        <w:gridCol w:w="832"/>
-        <w:gridCol w:w="832"/>
-        <w:gridCol w:w="832"/>
-        <w:gridCol w:w="832"/>
+        <w:gridCol w:w="786"/>
+        <w:gridCol w:w="786"/>
+        <w:gridCol w:w="786"/>
+        <w:gridCol w:w="786"/>
+        <w:gridCol w:w="786"/>
+        <w:gridCol w:w="786"/>
+        <w:gridCol w:w="786"/>
+        <w:gridCol w:w="786"/>
+        <w:gridCol w:w="786"/>
+        <w:gridCol w:w="786"/>
+        <w:gridCol w:w="786"/>
+        <w:gridCol w:w="786"/>
+        <w:gridCol w:w="786"/>
+        <w:gridCol w:w="786"/>
+        <w:gridCol w:w="786"/>
+        <w:gridCol w:w="786"/>
+        <w:gridCol w:w="786"/>
+        <w:gridCol w:w="786"/>
       </w:tblGrid>
       <w:tr>
         <w:tc>
           <w:tcPr>
-            <w:tcW w:type="dxa" w:w="832"/>
+            <w:tcW w:type="dxa" w:w="786"/>
           </w:tcPr>
           <w:p>
             <w:r>
@@ -3753,7 +3754,7 @@
         </w:tc>
         <w:tc>
           <w:tcPr>
-            <w:tcW w:type="dxa" w:w="832"/>
+            <w:tcW w:type="dxa" w:w="786"/>
           </w:tcPr>
           <w:p>
             <w:r>
@@ -3767,7 +3768,7 @@
         </w:tc>
         <w:tc>
           <w:tcPr>
-            <w:tcW w:type="dxa" w:w="832"/>
+            <w:tcW w:type="dxa" w:w="786"/>
           </w:tcPr>
           <w:p>
             <w:r>
@@ -3781,7 +3782,7 @@
         </w:tc>
         <w:tc>
           <w:tcPr>
-            <w:tcW w:type="dxa" w:w="832"/>
+            <w:tcW w:type="dxa" w:w="786"/>
           </w:tcPr>
           <w:p>
             <w:r>
@@ -3795,7 +3796,7 @@
         </w:tc>
         <w:tc>
           <w:tcPr>
-            <w:tcW w:type="dxa" w:w="832"/>
+            <w:tcW w:type="dxa" w:w="786"/>
           </w:tcPr>
           <w:p>
             <w:r>
@@ -3809,7 +3810,7 @@
         </w:tc>
         <w:tc>
           <w:tcPr>
-            <w:tcW w:type="dxa" w:w="832"/>
+            <w:tcW w:type="dxa" w:w="786"/>
           </w:tcPr>
           <w:p>
             <w:r>
@@ -3823,7 +3824,7 @@
         </w:tc>
         <w:tc>
           <w:tcPr>
-            <w:tcW w:type="dxa" w:w="832"/>
+            <w:tcW w:type="dxa" w:w="786"/>
           </w:tcPr>
           <w:p>
             <w:r>
@@ -3837,7 +3838,7 @@
         </w:tc>
         <w:tc>
           <w:tcPr>
-            <w:tcW w:type="dxa" w:w="832"/>
+            <w:tcW w:type="dxa" w:w="786"/>
           </w:tcPr>
           <w:p>
             <w:r>
@@ -3851,7 +3852,7 @@
         </w:tc>
         <w:tc>
           <w:tcPr>
-            <w:tcW w:type="dxa" w:w="832"/>
+            <w:tcW w:type="dxa" w:w="786"/>
           </w:tcPr>
           <w:p>
             <w:r>
@@ -3865,7 +3866,7 @@
         </w:tc>
         <w:tc>
           <w:tcPr>
-            <w:tcW w:type="dxa" w:w="832"/>
+            <w:tcW w:type="dxa" w:w="786"/>
           </w:tcPr>
           <w:p>
             <w:r>
@@ -3879,7 +3880,7 @@
         </w:tc>
         <w:tc>
           <w:tcPr>
-            <w:tcW w:type="dxa" w:w="832"/>
+            <w:tcW w:type="dxa" w:w="786"/>
           </w:tcPr>
           <w:p>
             <w:r>
@@ -3893,7 +3894,7 @@
         </w:tc>
         <w:tc>
           <w:tcPr>
-            <w:tcW w:type="dxa" w:w="832"/>
+            <w:tcW w:type="dxa" w:w="786"/>
           </w:tcPr>
           <w:p>
             <w:r>
@@ -3907,7 +3908,7 @@
         </w:tc>
         <w:tc>
           <w:tcPr>
-            <w:tcW w:type="dxa" w:w="832"/>
+            <w:tcW w:type="dxa" w:w="786"/>
           </w:tcPr>
           <w:p>
             <w:r>
@@ -3921,7 +3922,7 @@
         </w:tc>
         <w:tc>
           <w:tcPr>
-            <w:tcW w:type="dxa" w:w="832"/>
+            <w:tcW w:type="dxa" w:w="786"/>
           </w:tcPr>
           <w:p>
             <w:r>
@@ -3935,7 +3936,7 @@
         </w:tc>
         <w:tc>
           <w:tcPr>
-            <w:tcW w:type="dxa" w:w="832"/>
+            <w:tcW w:type="dxa" w:w="786"/>
           </w:tcPr>
           <w:p>
             <w:r>
@@ -3949,7 +3950,7 @@
         </w:tc>
         <w:tc>
           <w:tcPr>
-            <w:tcW w:type="dxa" w:w="832"/>
+            <w:tcW w:type="dxa" w:w="786"/>
           </w:tcPr>
           <w:p>
             <w:r>
@@ -3963,7 +3964,7 @@
         </w:tc>
         <w:tc>
           <w:tcPr>
-            <w:tcW w:type="dxa" w:w="832"/>
+            <w:tcW w:type="dxa" w:w="786"/>
           </w:tcPr>
           <w:p>
             <w:r>
@@ -3972,6 +3973,20 @@
                 <w:sz w:val="16"/>
               </w:rPr>
               <w:t>Galat</w:t>
+            </w:r>
+          </w:p>
+        </w:tc>
+        <w:tc>
+          <w:tcPr>
+            <w:tcW w:type="dxa" w:w="786"/>
+          </w:tcPr>
+          <w:p>
+            <w:r>
+              <w:rPr>
+                <w:b/>
+                <w:sz w:val="16"/>
+              </w:rPr>
+              <w:t>Catatan</w:t>
             </w:r>
           </w:p>
         </w:tc>
@@ -3979,7 +3994,7 @@
       <w:tr>
         <w:tc>
           <w:tcPr>
-            <w:tcW w:type="dxa" w:w="832"/>
+            <w:tcW w:type="dxa" w:w="786"/>
           </w:tcPr>
           <w:p>
             <w:r>
@@ -3992,7 +4007,7 @@
         </w:tc>
         <w:tc>
           <w:tcPr>
-            <w:tcW w:type="dxa" w:w="832"/>
+            <w:tcW w:type="dxa" w:w="786"/>
           </w:tcPr>
           <w:p>
             <w:r>
@@ -4005,7 +4020,7 @@
         </w:tc>
         <w:tc>
           <w:tcPr>
-            <w:tcW w:type="dxa" w:w="832"/>
+            <w:tcW w:type="dxa" w:w="786"/>
           </w:tcPr>
           <w:p>
             <w:r>
@@ -4018,7 +4033,7 @@
         </w:tc>
         <w:tc>
           <w:tcPr>
-            <w:tcW w:type="dxa" w:w="832"/>
+            <w:tcW w:type="dxa" w:w="786"/>
           </w:tcPr>
           <w:p>
             <w:r>
@@ -4031,7 +4046,7 @@
         </w:tc>
         <w:tc>
           <w:tcPr>
-            <w:tcW w:type="dxa" w:w="832"/>
+            <w:tcW w:type="dxa" w:w="786"/>
           </w:tcPr>
           <w:p>
             <w:r>
@@ -4044,7 +4059,7 @@
         </w:tc>
         <w:tc>
           <w:tcPr>
-            <w:tcW w:type="dxa" w:w="832"/>
+            <w:tcW w:type="dxa" w:w="786"/>
           </w:tcPr>
           <w:p>
             <w:r>
@@ -4057,7 +4072,7 @@
         </w:tc>
         <w:tc>
           <w:tcPr>
-            <w:tcW w:type="dxa" w:w="832"/>
+            <w:tcW w:type="dxa" w:w="786"/>
           </w:tcPr>
           <w:p>
             <w:r>
@@ -4070,7 +4085,7 @@
         </w:tc>
         <w:tc>
           <w:tcPr>
-            <w:tcW w:type="dxa" w:w="832"/>
+            <w:tcW w:type="dxa" w:w="786"/>
           </w:tcPr>
           <w:p>
             <w:r>
@@ -4083,7 +4098,7 @@
         </w:tc>
         <w:tc>
           <w:tcPr>
-            <w:tcW w:type="dxa" w:w="832"/>
+            <w:tcW w:type="dxa" w:w="786"/>
           </w:tcPr>
           <w:p>
             <w:r>
@@ -4096,7 +4111,7 @@
         </w:tc>
         <w:tc>
           <w:tcPr>
-            <w:tcW w:type="dxa" w:w="832"/>
+            <w:tcW w:type="dxa" w:w="786"/>
           </w:tcPr>
           <w:p>
             <w:r>
@@ -4109,7 +4124,7 @@
         </w:tc>
         <w:tc>
           <w:tcPr>
-            <w:tcW w:type="dxa" w:w="832"/>
+            <w:tcW w:type="dxa" w:w="786"/>
           </w:tcPr>
           <w:p>
             <w:r>
@@ -4122,7 +4137,7 @@
         </w:tc>
         <w:tc>
           <w:tcPr>
-            <w:tcW w:type="dxa" w:w="832"/>
+            <w:tcW w:type="dxa" w:w="786"/>
           </w:tcPr>
           <w:p>
             <w:r>
@@ -4135,7 +4150,7 @@
         </w:tc>
         <w:tc>
           <w:tcPr>
-            <w:tcW w:type="dxa" w:w="832"/>
+            <w:tcW w:type="dxa" w:w="786"/>
           </w:tcPr>
           <w:p>
             <w:r>
@@ -4148,7 +4163,7 @@
         </w:tc>
         <w:tc>
           <w:tcPr>
-            <w:tcW w:type="dxa" w:w="832"/>
+            <w:tcW w:type="dxa" w:w="786"/>
           </w:tcPr>
           <w:p>
             <w:r>
@@ -4161,7 +4176,7 @@
         </w:tc>
         <w:tc>
           <w:tcPr>
-            <w:tcW w:type="dxa" w:w="832"/>
+            <w:tcW w:type="dxa" w:w="786"/>
           </w:tcPr>
           <w:p>
             <w:r>
@@ -4174,20 +4189,32 @@
         </w:tc>
         <w:tc>
           <w:tcPr>
-            <w:tcW w:type="dxa" w:w="832"/>
-          </w:tcPr>
-          <w:p>
-            <w:r>
-              <w:rPr>
-                <w:sz w:val="16"/>
-              </w:rPr>
-              <w:t>2,12</w:t>
-            </w:r>
-          </w:p>
-        </w:tc>
-        <w:tc>
-          <w:tcPr>
-            <w:tcW w:type="dxa" w:w="832"/>
+            <w:tcW w:type="dxa" w:w="786"/>
+          </w:tcPr>
+          <w:p>
+            <w:r>
+              <w:rPr>
+                <w:sz w:val="16"/>
+              </w:rPr>
+              <w:t>2,13</w:t>
+            </w:r>
+          </w:p>
+        </w:tc>
+        <w:tc>
+          <w:tcPr>
+            <w:tcW w:type="dxa" w:w="786"/>
+          </w:tcPr>
+          <w:p>
+            <w:r>
+              <w:rPr>
+                <w:sz w:val="16"/>
+              </w:rPr>
+            </w:r>
+          </w:p>
+        </w:tc>
+        <w:tc>
+          <w:tcPr>
+            <w:tcW w:type="dxa" w:w="786"/>
           </w:tcPr>
           <w:p>
             <w:r>
@@ -4201,7 +4228,7 @@
       <w:tr>
         <w:tc>
           <w:tcPr>
-            <w:tcW w:type="dxa" w:w="832"/>
+            <w:tcW w:type="dxa" w:w="786"/>
           </w:tcPr>
           <w:p>
             <w:r>
@@ -4214,7 +4241,7 @@
         </w:tc>
         <w:tc>
           <w:tcPr>
-            <w:tcW w:type="dxa" w:w="832"/>
+            <w:tcW w:type="dxa" w:w="786"/>
           </w:tcPr>
           <w:p>
             <w:r>
@@ -4227,7 +4254,7 @@
         </w:tc>
         <w:tc>
           <w:tcPr>
-            <w:tcW w:type="dxa" w:w="832"/>
+            <w:tcW w:type="dxa" w:w="786"/>
           </w:tcPr>
           <w:p>
             <w:r>
@@ -4240,7 +4267,7 @@
         </w:tc>
         <w:tc>
           <w:tcPr>
-            <w:tcW w:type="dxa" w:w="832"/>
+            <w:tcW w:type="dxa" w:w="786"/>
           </w:tcPr>
           <w:p>
             <w:r>
@@ -4253,7 +4280,7 @@
         </w:tc>
         <w:tc>
           <w:tcPr>
-            <w:tcW w:type="dxa" w:w="832"/>
+            <w:tcW w:type="dxa" w:w="786"/>
           </w:tcPr>
           <w:p>
             <w:r>
@@ -4266,7 +4293,7 @@
         </w:tc>
         <w:tc>
           <w:tcPr>
-            <w:tcW w:type="dxa" w:w="832"/>
+            <w:tcW w:type="dxa" w:w="786"/>
           </w:tcPr>
           <w:p>
             <w:r>
@@ -4279,7 +4306,7 @@
         </w:tc>
         <w:tc>
           <w:tcPr>
-            <w:tcW w:type="dxa" w:w="832"/>
+            <w:tcW w:type="dxa" w:w="786"/>
           </w:tcPr>
           <w:p>
             <w:r>
@@ -4292,7 +4319,7 @@
         </w:tc>
         <w:tc>
           <w:tcPr>
-            <w:tcW w:type="dxa" w:w="832"/>
+            <w:tcW w:type="dxa" w:w="786"/>
           </w:tcPr>
           <w:p>
             <w:r>
@@ -4305,7 +4332,7 @@
         </w:tc>
         <w:tc>
           <w:tcPr>
-            <w:tcW w:type="dxa" w:w="832"/>
+            <w:tcW w:type="dxa" w:w="786"/>
           </w:tcPr>
           <w:p>
             <w:r>
@@ -4318,7 +4345,7 @@
         </w:tc>
         <w:tc>
           <w:tcPr>
-            <w:tcW w:type="dxa" w:w="832"/>
+            <w:tcW w:type="dxa" w:w="786"/>
           </w:tcPr>
           <w:p>
             <w:r>
@@ -4331,7 +4358,7 @@
         </w:tc>
         <w:tc>
           <w:tcPr>
-            <w:tcW w:type="dxa" w:w="832"/>
+            <w:tcW w:type="dxa" w:w="786"/>
           </w:tcPr>
           <w:p>
             <w:r>
@@ -4344,7 +4371,7 @@
         </w:tc>
         <w:tc>
           <w:tcPr>
-            <w:tcW w:type="dxa" w:w="832"/>
+            <w:tcW w:type="dxa" w:w="786"/>
           </w:tcPr>
           <w:p>
             <w:r>
@@ -4357,7 +4384,7 @@
         </w:tc>
         <w:tc>
           <w:tcPr>
-            <w:tcW w:type="dxa" w:w="832"/>
+            <w:tcW w:type="dxa" w:w="786"/>
           </w:tcPr>
           <w:p>
             <w:r>
@@ -4370,7 +4397,7 @@
         </w:tc>
         <w:tc>
           <w:tcPr>
-            <w:tcW w:type="dxa" w:w="832"/>
+            <w:tcW w:type="dxa" w:w="786"/>
           </w:tcPr>
           <w:p>
             <w:r>
@@ -4383,7 +4410,7 @@
         </w:tc>
         <w:tc>
           <w:tcPr>
-            <w:tcW w:type="dxa" w:w="832"/>
+            <w:tcW w:type="dxa" w:w="786"/>
           </w:tcPr>
           <w:p>
             <w:r>
@@ -4396,7 +4423,7 @@
         </w:tc>
         <w:tc>
           <w:tcPr>
-            <w:tcW w:type="dxa" w:w="832"/>
+            <w:tcW w:type="dxa" w:w="786"/>
           </w:tcPr>
           <w:p>
             <w:r>
@@ -4409,7 +4436,19 @@
         </w:tc>
         <w:tc>
           <w:tcPr>
-            <w:tcW w:type="dxa" w:w="832"/>
+            <w:tcW w:type="dxa" w:w="786"/>
+          </w:tcPr>
+          <w:p>
+            <w:r>
+              <w:rPr>
+                <w:sz w:val="16"/>
+              </w:rPr>
+            </w:r>
+          </w:p>
+        </w:tc>
+        <w:tc>
+          <w:tcPr>
+            <w:tcW w:type="dxa" w:w="786"/>
           </w:tcPr>
           <w:p>
             <w:r>
@@ -4423,7 +4462,7 @@
       <w:tr>
         <w:tc>
           <w:tcPr>
-            <w:tcW w:type="dxa" w:w="832"/>
+            <w:tcW w:type="dxa" w:w="786"/>
           </w:tcPr>
           <w:p>
             <w:r>
@@ -4436,7 +4475,7 @@
         </w:tc>
         <w:tc>
           <w:tcPr>
-            <w:tcW w:type="dxa" w:w="832"/>
+            <w:tcW w:type="dxa" w:w="786"/>
           </w:tcPr>
           <w:p>
             <w:r>
@@ -4449,7 +4488,7 @@
         </w:tc>
         <w:tc>
           <w:tcPr>
-            <w:tcW w:type="dxa" w:w="832"/>
+            <w:tcW w:type="dxa" w:w="786"/>
           </w:tcPr>
           <w:p>
             <w:r>
@@ -4462,7 +4501,7 @@
         </w:tc>
         <w:tc>
           <w:tcPr>
-            <w:tcW w:type="dxa" w:w="832"/>
+            <w:tcW w:type="dxa" w:w="786"/>
           </w:tcPr>
           <w:p>
             <w:r>
@@ -4475,7 +4514,7 @@
         </w:tc>
         <w:tc>
           <w:tcPr>
-            <w:tcW w:type="dxa" w:w="832"/>
+            <w:tcW w:type="dxa" w:w="786"/>
           </w:tcPr>
           <w:p>
             <w:r>
@@ -4488,7 +4527,7 @@
         </w:tc>
         <w:tc>
           <w:tcPr>
-            <w:tcW w:type="dxa" w:w="832"/>
+            <w:tcW w:type="dxa" w:w="786"/>
           </w:tcPr>
           <w:p>
             <w:r>
@@ -4501,7 +4540,7 @@
         </w:tc>
         <w:tc>
           <w:tcPr>
-            <w:tcW w:type="dxa" w:w="832"/>
+            <w:tcW w:type="dxa" w:w="786"/>
           </w:tcPr>
           <w:p>
             <w:r>
@@ -4514,7 +4553,7 @@
         </w:tc>
         <w:tc>
           <w:tcPr>
-            <w:tcW w:type="dxa" w:w="832"/>
+            <w:tcW w:type="dxa" w:w="786"/>
           </w:tcPr>
           <w:p>
             <w:r>
@@ -4527,7 +4566,7 @@
         </w:tc>
         <w:tc>
           <w:tcPr>
-            <w:tcW w:type="dxa" w:w="832"/>
+            <w:tcW w:type="dxa" w:w="786"/>
           </w:tcPr>
           <w:p>
             <w:r>
@@ -4540,7 +4579,7 @@
         </w:tc>
         <w:tc>
           <w:tcPr>
-            <w:tcW w:type="dxa" w:w="832"/>
+            <w:tcW w:type="dxa" w:w="786"/>
           </w:tcPr>
           <w:p>
             <w:r>
@@ -4553,7 +4592,7 @@
         </w:tc>
         <w:tc>
           <w:tcPr>
-            <w:tcW w:type="dxa" w:w="832"/>
+            <w:tcW w:type="dxa" w:w="786"/>
           </w:tcPr>
           <w:p>
             <w:r>
@@ -4566,7 +4605,7 @@
         </w:tc>
         <w:tc>
           <w:tcPr>
-            <w:tcW w:type="dxa" w:w="832"/>
+            <w:tcW w:type="dxa" w:w="786"/>
           </w:tcPr>
           <w:p>
             <w:r>
@@ -4579,7 +4618,7 @@
         </w:tc>
         <w:tc>
           <w:tcPr>
-            <w:tcW w:type="dxa" w:w="832"/>
+            <w:tcW w:type="dxa" w:w="786"/>
           </w:tcPr>
           <w:p>
             <w:r>
@@ -4592,7 +4631,7 @@
         </w:tc>
         <w:tc>
           <w:tcPr>
-            <w:tcW w:type="dxa" w:w="832"/>
+            <w:tcW w:type="dxa" w:w="786"/>
           </w:tcPr>
           <w:p>
             <w:r>
@@ -4605,7 +4644,7 @@
         </w:tc>
         <w:tc>
           <w:tcPr>
-            <w:tcW w:type="dxa" w:w="832"/>
+            <w:tcW w:type="dxa" w:w="786"/>
           </w:tcPr>
           <w:p>
             <w:r>
@@ -4618,20 +4657,32 @@
         </w:tc>
         <w:tc>
           <w:tcPr>
-            <w:tcW w:type="dxa" w:w="832"/>
-          </w:tcPr>
-          <w:p>
-            <w:r>
-              <w:rPr>
-                <w:sz w:val="16"/>
-              </w:rPr>
-              <w:t>1,86</w:t>
-            </w:r>
-          </w:p>
-        </w:tc>
-        <w:tc>
-          <w:tcPr>
-            <w:tcW w:type="dxa" w:w="832"/>
+            <w:tcW w:type="dxa" w:w="786"/>
+          </w:tcPr>
+          <w:p>
+            <w:r>
+              <w:rPr>
+                <w:sz w:val="16"/>
+              </w:rPr>
+              <w:t>1,87</w:t>
+            </w:r>
+          </w:p>
+        </w:tc>
+        <w:tc>
+          <w:tcPr>
+            <w:tcW w:type="dxa" w:w="786"/>
+          </w:tcPr>
+          <w:p>
+            <w:r>
+              <w:rPr>
+                <w:sz w:val="16"/>
+              </w:rPr>
+            </w:r>
+          </w:p>
+        </w:tc>
+        <w:tc>
+          <w:tcPr>
+            <w:tcW w:type="dxa" w:w="786"/>
           </w:tcPr>
           <w:p>
             <w:r>
@@ -4645,7 +4696,7 @@
       <w:tr>
         <w:tc>
           <w:tcPr>
-            <w:tcW w:type="dxa" w:w="832"/>
+            <w:tcW w:type="dxa" w:w="786"/>
           </w:tcPr>
           <w:p>
             <w:r>
@@ -4658,7 +4709,7 @@
         </w:tc>
         <w:tc>
           <w:tcPr>
-            <w:tcW w:type="dxa" w:w="832"/>
+            <w:tcW w:type="dxa" w:w="786"/>
           </w:tcPr>
           <w:p>
             <w:r>
@@ -4671,7 +4722,7 @@
         </w:tc>
         <w:tc>
           <w:tcPr>
-            <w:tcW w:type="dxa" w:w="832"/>
+            <w:tcW w:type="dxa" w:w="786"/>
           </w:tcPr>
           <w:p>
             <w:r>
@@ -4684,7 +4735,7 @@
         </w:tc>
         <w:tc>
           <w:tcPr>
-            <w:tcW w:type="dxa" w:w="832"/>
+            <w:tcW w:type="dxa" w:w="786"/>
           </w:tcPr>
           <w:p>
             <w:r>
@@ -4697,7 +4748,7 @@
         </w:tc>
         <w:tc>
           <w:tcPr>
-            <w:tcW w:type="dxa" w:w="832"/>
+            <w:tcW w:type="dxa" w:w="786"/>
           </w:tcPr>
           <w:p>
             <w:r>
@@ -4710,7 +4761,7 @@
         </w:tc>
         <w:tc>
           <w:tcPr>
-            <w:tcW w:type="dxa" w:w="832"/>
+            <w:tcW w:type="dxa" w:w="786"/>
           </w:tcPr>
           <w:p>
             <w:r>
@@ -4723,7 +4774,7 @@
         </w:tc>
         <w:tc>
           <w:tcPr>
-            <w:tcW w:type="dxa" w:w="832"/>
+            <w:tcW w:type="dxa" w:w="786"/>
           </w:tcPr>
           <w:p>
             <w:r>
@@ -4736,7 +4787,7 @@
         </w:tc>
         <w:tc>
           <w:tcPr>
-            <w:tcW w:type="dxa" w:w="832"/>
+            <w:tcW w:type="dxa" w:w="786"/>
           </w:tcPr>
           <w:p>
             <w:r>
@@ -4749,7 +4800,7 @@
         </w:tc>
         <w:tc>
           <w:tcPr>
-            <w:tcW w:type="dxa" w:w="832"/>
+            <w:tcW w:type="dxa" w:w="786"/>
           </w:tcPr>
           <w:p>
             <w:r>
@@ -4762,7 +4813,7 @@
         </w:tc>
         <w:tc>
           <w:tcPr>
-            <w:tcW w:type="dxa" w:w="832"/>
+            <w:tcW w:type="dxa" w:w="786"/>
           </w:tcPr>
           <w:p>
             <w:r>
@@ -4775,7 +4826,7 @@
         </w:tc>
         <w:tc>
           <w:tcPr>
-            <w:tcW w:type="dxa" w:w="832"/>
+            <w:tcW w:type="dxa" w:w="786"/>
           </w:tcPr>
           <w:p>
             <w:r>
@@ -4788,7 +4839,7 @@
         </w:tc>
         <w:tc>
           <w:tcPr>
-            <w:tcW w:type="dxa" w:w="832"/>
+            <w:tcW w:type="dxa" w:w="786"/>
           </w:tcPr>
           <w:p>
             <w:r>
@@ -4801,7 +4852,7 @@
         </w:tc>
         <w:tc>
           <w:tcPr>
-            <w:tcW w:type="dxa" w:w="832"/>
+            <w:tcW w:type="dxa" w:w="786"/>
           </w:tcPr>
           <w:p>
             <w:r>
@@ -4814,7 +4865,7 @@
         </w:tc>
         <w:tc>
           <w:tcPr>
-            <w:tcW w:type="dxa" w:w="832"/>
+            <w:tcW w:type="dxa" w:w="786"/>
           </w:tcPr>
           <w:p>
             <w:r>
@@ -4827,7 +4878,7 @@
         </w:tc>
         <w:tc>
           <w:tcPr>
-            <w:tcW w:type="dxa" w:w="832"/>
+            <w:tcW w:type="dxa" w:w="786"/>
           </w:tcPr>
           <w:p>
             <w:r>
@@ -4840,26 +4891,39 @@
         </w:tc>
         <w:tc>
           <w:tcPr>
-            <w:tcW w:type="dxa" w:w="832"/>
-          </w:tcPr>
-          <w:p>
-            <w:r>
-              <w:rPr>
-                <w:sz w:val="16"/>
-              </w:rPr>
-              <w:t>21,73</w:t>
-            </w:r>
-          </w:p>
-        </w:tc>
-        <w:tc>
-          <w:tcPr>
-            <w:tcW w:type="dxa" w:w="832"/>
-          </w:tcPr>
-          <w:p>
-            <w:r>
-              <w:rPr>
-                <w:sz w:val="16"/>
-              </w:rPr>
+            <w:tcW w:type="dxa" w:w="786"/>
+          </w:tcPr>
+          <w:p>
+            <w:r>
+              <w:rPr>
+                <w:sz w:val="16"/>
+              </w:rPr>
+              <w:t>21,65</w:t>
+            </w:r>
+          </w:p>
+        </w:tc>
+        <w:tc>
+          <w:tcPr>
+            <w:tcW w:type="dxa" w:w="786"/>
+          </w:tcPr>
+          <w:p>
+            <w:r>
+              <w:rPr>
+                <w:sz w:val="16"/>
+              </w:rPr>
+            </w:r>
+          </w:p>
+        </w:tc>
+        <w:tc>
+          <w:tcPr>
+            <w:tcW w:type="dxa" w:w="786"/>
+          </w:tcPr>
+          <w:p>
+            <w:r>
+              <w:rPr>
+                <w:sz w:val="16"/>
+              </w:rPr>
+              <w:t>nyaris degeneratif (klaster terbesar 89,3%; batas 90%)</w:t>
             </w:r>
           </w:p>
         </w:tc>
@@ -4867,7 +4931,7 @@
       <w:tr>
         <w:tc>
           <w:tcPr>
-            <w:tcW w:type="dxa" w:w="832"/>
+            <w:tcW w:type="dxa" w:w="786"/>
           </w:tcPr>
           <w:p>
             <w:r>
@@ -4880,7 +4944,7 @@
         </w:tc>
         <w:tc>
           <w:tcPr>
-            <w:tcW w:type="dxa" w:w="832"/>
+            <w:tcW w:type="dxa" w:w="786"/>
           </w:tcPr>
           <w:p>
             <w:r>
@@ -4893,7 +4957,7 @@
         </w:tc>
         <w:tc>
           <w:tcPr>
-            <w:tcW w:type="dxa" w:w="832"/>
+            <w:tcW w:type="dxa" w:w="786"/>
           </w:tcPr>
           <w:p>
             <w:r>
@@ -4906,7 +4970,7 @@
         </w:tc>
         <w:tc>
           <w:tcPr>
-            <w:tcW w:type="dxa" w:w="832"/>
+            <w:tcW w:type="dxa" w:w="786"/>
           </w:tcPr>
           <w:p>
             <w:r>
@@ -4919,7 +4983,7 @@
         </w:tc>
         <w:tc>
           <w:tcPr>
-            <w:tcW w:type="dxa" w:w="832"/>
+            <w:tcW w:type="dxa" w:w="786"/>
           </w:tcPr>
           <w:p>
             <w:r>
@@ -4932,7 +4996,7 @@
         </w:tc>
         <w:tc>
           <w:tcPr>
-            <w:tcW w:type="dxa" w:w="832"/>
+            <w:tcW w:type="dxa" w:w="786"/>
           </w:tcPr>
           <w:p>
             <w:r>
@@ -4945,7 +5009,7 @@
         </w:tc>
         <w:tc>
           <w:tcPr>
-            <w:tcW w:type="dxa" w:w="832"/>
+            <w:tcW w:type="dxa" w:w="786"/>
           </w:tcPr>
           <w:p>
             <w:r>
@@ -4958,7 +5022,7 @@
         </w:tc>
         <w:tc>
           <w:tcPr>
-            <w:tcW w:type="dxa" w:w="832"/>
+            <w:tcW w:type="dxa" w:w="786"/>
           </w:tcPr>
           <w:p>
             <w:r>
@@ -4971,7 +5035,7 @@
         </w:tc>
         <w:tc>
           <w:tcPr>
-            <w:tcW w:type="dxa" w:w="832"/>
+            <w:tcW w:type="dxa" w:w="786"/>
           </w:tcPr>
           <w:p>
             <w:r>
@@ -4984,7 +5048,7 @@
         </w:tc>
         <w:tc>
           <w:tcPr>
-            <w:tcW w:type="dxa" w:w="832"/>
+            <w:tcW w:type="dxa" w:w="786"/>
           </w:tcPr>
           <w:p>
             <w:r>
@@ -4997,7 +5061,7 @@
         </w:tc>
         <w:tc>
           <w:tcPr>
-            <w:tcW w:type="dxa" w:w="832"/>
+            <w:tcW w:type="dxa" w:w="786"/>
           </w:tcPr>
           <w:p>
             <w:r>
@@ -5010,7 +5074,7 @@
         </w:tc>
         <w:tc>
           <w:tcPr>
-            <w:tcW w:type="dxa" w:w="832"/>
+            <w:tcW w:type="dxa" w:w="786"/>
           </w:tcPr>
           <w:p>
             <w:r>
@@ -5023,7 +5087,7 @@
         </w:tc>
         <w:tc>
           <w:tcPr>
-            <w:tcW w:type="dxa" w:w="832"/>
+            <w:tcW w:type="dxa" w:w="786"/>
           </w:tcPr>
           <w:p>
             <w:r>
@@ -5036,7 +5100,7 @@
         </w:tc>
         <w:tc>
           <w:tcPr>
-            <w:tcW w:type="dxa" w:w="832"/>
+            <w:tcW w:type="dxa" w:w="786"/>
           </w:tcPr>
           <w:p>
             <w:r>
@@ -5049,7 +5113,7 @@
         </w:tc>
         <w:tc>
           <w:tcPr>
-            <w:tcW w:type="dxa" w:w="832"/>
+            <w:tcW w:type="dxa" w:w="786"/>
           </w:tcPr>
           <w:p>
             <w:r>
@@ -5062,20 +5126,20 @@
         </w:tc>
         <w:tc>
           <w:tcPr>
-            <w:tcW w:type="dxa" w:w="832"/>
-          </w:tcPr>
-          <w:p>
-            <w:r>
-              <w:rPr>
-                <w:sz w:val="16"/>
-              </w:rPr>
-              <w:t>2,63</w:t>
-            </w:r>
-          </w:p>
-        </w:tc>
-        <w:tc>
-          <w:tcPr>
-            <w:tcW w:type="dxa" w:w="832"/>
+            <w:tcW w:type="dxa" w:w="786"/>
+          </w:tcPr>
+          <w:p>
+            <w:r>
+              <w:rPr>
+                <w:sz w:val="16"/>
+              </w:rPr>
+              <w:t>3,25</w:t>
+            </w:r>
+          </w:p>
+        </w:tc>
+        <w:tc>
+          <w:tcPr>
+            <w:tcW w:type="dxa" w:w="786"/>
           </w:tcPr>
           <w:p>
             <w:r>
@@ -5083,6 +5147,19 @@
                 <w:sz w:val="16"/>
               </w:rPr>
               <w:t>ValueError: Islands must be larger than the quorum. If not, drop the small islands and solve for clusters in the remaining field.</w:t>
+            </w:r>
+          </w:p>
+        </w:tc>
+        <w:tc>
+          <w:tcPr>
+            <w:tcW w:type="dxa" w:w="786"/>
+          </w:tcPr>
+          <w:p>
+            <w:r>
+              <w:rPr>
+                <w:sz w:val="16"/>
+              </w:rPr>
+              <w:t>gagal dijalankan; tidak layak dibandingkan</w:t>
             </w:r>
           </w:p>
         </w:tc>
@@ -13143,7 +13220,7 @@
                 <w:b/>
                 <w:sz w:val="16"/>
               </w:rPr>
-              <w:t>Terputus</w:t>
+              <w:t>TES terdekat tidak terjangkau</w:t>
             </w:r>
           </w:p>
         </w:tc>
@@ -13701,7 +13778,7 @@
           <w:i/>
           <w:sz w:val="16"/>
         </w:rPr>
-        <w:t>Grid non-Tergenang yang terjangkau: TAS bila DI_t ≥ 2, T_ideal ≤ 5 menit (garis lurus ≤ 400 m), dan T_aktual ≥ 30 menit (batas waktu evakuasi; Li dkk., 2026). Batas minimum 50 m pada T_ideal dan T_aktual. Terputus = non-Tergenang tidak menjangkau TES.</w:t>
+        <w:t>Grid non-Tergenang yang terjangkau: TAS bila DI_t ≥ 2, T_ideal ≤ 5 menit (garis lurus ≤ 400 m), dan T_aktual ≥ 30 menit (batas waktu evakuasi; Li dkk., 2026). Batas minimum 50 m pada T_ideal dan T_aktual. TES terdekat tidak terjangkau = non-Tergenang yang TES terdekatnya secara garis lurus tidak dapat dicapai lewat jaringan (T_aktual = penalti); berbeda dengan kategori akses Terputus (T18).</w:t>
       </w:r>
     </w:p>
     <w:p>
@@ -15803,7 +15880,7 @@
                 <w:b/>
                 <w:sz w:val="16"/>
               </w:rPr>
-              <w:t>dari Terputus Baseline</w:t>
+              <w:t>dari TES terdekat tidak terjangkau (Baseline)</w:t>
             </w:r>
           </w:p>
         </w:tc>
@@ -15859,7 +15936,7 @@
                 <w:b/>
                 <w:sz w:val="16"/>
               </w:rPr>
-              <w:t>hilang: jadi Terputus</w:t>
+              <w:t>hilang: jadi TES terdekat tidak terjangkau</w:t>
             </w:r>
           </w:p>
         </w:tc>
@@ -23770,6 +23847,377 @@
         <w:pStyle w:val="Heading2"/>
       </w:pPr>
       <w:r>
+        <w:t>T19e. Transisi kategori akses Baseline → Sedang (batas 30 menit; jumlah grid)</w:t>
+      </w:r>
+    </w:p>
+    <w:tbl>
+      <w:tblPr>
+        <w:tblStyle w:val="TableGrid"/>
+        <w:tblW w:type="auto" w:w="0"/>
+        <w:tblLook w:firstColumn="1" w:firstRow="1" w:lastColumn="0" w:lastRow="0" w:noHBand="0" w:noVBand="1" w:val="04A0"/>
+      </w:tblPr>
+      <w:tblGrid>
+        <w:gridCol w:w="2828"/>
+        <w:gridCol w:w="2828"/>
+        <w:gridCol w:w="2828"/>
+        <w:gridCol w:w="2828"/>
+        <w:gridCol w:w="2828"/>
+      </w:tblGrid>
+      <w:tr>
+        <w:tc>
+          <w:tcPr>
+            <w:tcW w:type="dxa" w:w="2828"/>
+          </w:tcPr>
+          <w:p>
+            <w:r>
+              <w:rPr>
+                <w:b/>
+                <w:sz w:val="16"/>
+              </w:rPr>
+              <w:t>Dari</w:t>
+            </w:r>
+          </w:p>
+        </w:tc>
+        <w:tc>
+          <w:tcPr>
+            <w:tcW w:type="dxa" w:w="2828"/>
+          </w:tcPr>
+          <w:p>
+            <w:r>
+              <w:rPr>
+                <w:b/>
+                <w:sz w:val="16"/>
+              </w:rPr>
+              <w:t>ke Terjangkau</w:t>
+            </w:r>
+          </w:p>
+        </w:tc>
+        <w:tc>
+          <w:tcPr>
+            <w:tcW w:type="dxa" w:w="2828"/>
+          </w:tcPr>
+          <w:p>
+            <w:r>
+              <w:rPr>
+                <w:b/>
+                <w:sz w:val="16"/>
+              </w:rPr>
+              <w:t>ke Jauh</w:t>
+            </w:r>
+          </w:p>
+        </w:tc>
+        <w:tc>
+          <w:tcPr>
+            <w:tcW w:type="dxa" w:w="2828"/>
+          </w:tcPr>
+          <w:p>
+            <w:r>
+              <w:rPr>
+                <w:b/>
+                <w:sz w:val="16"/>
+              </w:rPr>
+              <w:t>ke Terputus</w:t>
+            </w:r>
+          </w:p>
+        </w:tc>
+        <w:tc>
+          <w:tcPr>
+            <w:tcW w:type="dxa" w:w="2828"/>
+          </w:tcPr>
+          <w:p>
+            <w:r>
+              <w:rPr>
+                <w:b/>
+                <w:sz w:val="16"/>
+              </w:rPr>
+              <w:t>ke Tergenang</w:t>
+            </w:r>
+          </w:p>
+        </w:tc>
+      </w:tr>
+      <w:tr>
+        <w:tc>
+          <w:tcPr>
+            <w:tcW w:type="dxa" w:w="2828"/>
+          </w:tcPr>
+          <w:p>
+            <w:r>
+              <w:rPr>
+                <w:sz w:val="16"/>
+              </w:rPr>
+              <w:t>Terjangkau</w:t>
+            </w:r>
+          </w:p>
+        </w:tc>
+        <w:tc>
+          <w:tcPr>
+            <w:tcW w:type="dxa" w:w="2828"/>
+          </w:tcPr>
+          <w:p>
+            <w:r>
+              <w:rPr>
+                <w:sz w:val="16"/>
+              </w:rPr>
+              <w:t>18.730</w:t>
+            </w:r>
+          </w:p>
+        </w:tc>
+        <w:tc>
+          <w:tcPr>
+            <w:tcW w:type="dxa" w:w="2828"/>
+          </w:tcPr>
+          <w:p>
+            <w:r>
+              <w:rPr>
+                <w:sz w:val="16"/>
+              </w:rPr>
+              <w:t>54</w:t>
+            </w:r>
+          </w:p>
+        </w:tc>
+        <w:tc>
+          <w:tcPr>
+            <w:tcW w:type="dxa" w:w="2828"/>
+          </w:tcPr>
+          <w:p>
+            <w:r>
+              <w:rPr>
+                <w:sz w:val="16"/>
+              </w:rPr>
+              <w:t>360</w:t>
+            </w:r>
+          </w:p>
+        </w:tc>
+        <w:tc>
+          <w:tcPr>
+            <w:tcW w:type="dxa" w:w="2828"/>
+          </w:tcPr>
+          <w:p>
+            <w:r>
+              <w:rPr>
+                <w:sz w:val="16"/>
+              </w:rPr>
+              <w:t>3.213</w:t>
+            </w:r>
+          </w:p>
+        </w:tc>
+      </w:tr>
+      <w:tr>
+        <w:tc>
+          <w:tcPr>
+            <w:tcW w:type="dxa" w:w="2828"/>
+          </w:tcPr>
+          <w:p>
+            <w:r>
+              <w:rPr>
+                <w:sz w:val="16"/>
+              </w:rPr>
+              <w:t>Jauh</w:t>
+            </w:r>
+          </w:p>
+        </w:tc>
+        <w:tc>
+          <w:tcPr>
+            <w:tcW w:type="dxa" w:w="2828"/>
+          </w:tcPr>
+          <w:p>
+            <w:r>
+              <w:rPr>
+                <w:sz w:val="16"/>
+              </w:rPr>
+              <w:t>2</w:t>
+            </w:r>
+          </w:p>
+        </w:tc>
+        <w:tc>
+          <w:tcPr>
+            <w:tcW w:type="dxa" w:w="2828"/>
+          </w:tcPr>
+          <w:p>
+            <w:r>
+              <w:rPr>
+                <w:sz w:val="16"/>
+              </w:rPr>
+              <w:t>10</w:t>
+            </w:r>
+          </w:p>
+        </w:tc>
+        <w:tc>
+          <w:tcPr>
+            <w:tcW w:type="dxa" w:w="2828"/>
+          </w:tcPr>
+          <w:p>
+            <w:r>
+              <w:rPr>
+                <w:sz w:val="16"/>
+              </w:rPr>
+              <w:t>64</w:t>
+            </w:r>
+          </w:p>
+        </w:tc>
+        <w:tc>
+          <w:tcPr>
+            <w:tcW w:type="dxa" w:w="2828"/>
+          </w:tcPr>
+          <w:p>
+            <w:r>
+              <w:rPr>
+                <w:sz w:val="16"/>
+              </w:rPr>
+              <w:t>129</w:t>
+            </w:r>
+          </w:p>
+        </w:tc>
+      </w:tr>
+      <w:tr>
+        <w:tc>
+          <w:tcPr>
+            <w:tcW w:type="dxa" w:w="2828"/>
+          </w:tcPr>
+          <w:p>
+            <w:r>
+              <w:rPr>
+                <w:sz w:val="16"/>
+              </w:rPr>
+              <w:t>Terputus</w:t>
+            </w:r>
+          </w:p>
+        </w:tc>
+        <w:tc>
+          <w:tcPr>
+            <w:tcW w:type="dxa" w:w="2828"/>
+          </w:tcPr>
+          <w:p>
+            <w:r>
+              <w:rPr>
+                <w:sz w:val="16"/>
+              </w:rPr>
+              <w:t>0</w:t>
+            </w:r>
+          </w:p>
+        </w:tc>
+        <w:tc>
+          <w:tcPr>
+            <w:tcW w:type="dxa" w:w="2828"/>
+          </w:tcPr>
+          <w:p>
+            <w:r>
+              <w:rPr>
+                <w:sz w:val="16"/>
+              </w:rPr>
+              <w:t>0</w:t>
+            </w:r>
+          </w:p>
+        </w:tc>
+        <w:tc>
+          <w:tcPr>
+            <w:tcW w:type="dxa" w:w="2828"/>
+          </w:tcPr>
+          <w:p>
+            <w:r>
+              <w:rPr>
+                <w:sz w:val="16"/>
+              </w:rPr>
+              <w:t>78</w:t>
+            </w:r>
+          </w:p>
+        </w:tc>
+        <w:tc>
+          <w:tcPr>
+            <w:tcW w:type="dxa" w:w="2828"/>
+          </w:tcPr>
+          <w:p>
+            <w:r>
+              <w:rPr>
+                <w:sz w:val="16"/>
+              </w:rPr>
+              <w:t>33</w:t>
+            </w:r>
+          </w:p>
+        </w:tc>
+      </w:tr>
+      <w:tr>
+        <w:tc>
+          <w:tcPr>
+            <w:tcW w:type="dxa" w:w="2828"/>
+          </w:tcPr>
+          <w:p>
+            <w:r>
+              <w:rPr>
+                <w:sz w:val="16"/>
+              </w:rPr>
+              <w:t>Tergenang</w:t>
+            </w:r>
+          </w:p>
+        </w:tc>
+        <w:tc>
+          <w:tcPr>
+            <w:tcW w:type="dxa" w:w="2828"/>
+          </w:tcPr>
+          <w:p>
+            <w:r>
+              <w:rPr>
+                <w:sz w:val="16"/>
+              </w:rPr>
+              <w:t>0</w:t>
+            </w:r>
+          </w:p>
+        </w:tc>
+        <w:tc>
+          <w:tcPr>
+            <w:tcW w:type="dxa" w:w="2828"/>
+          </w:tcPr>
+          <w:p>
+            <w:r>
+              <w:rPr>
+                <w:sz w:val="16"/>
+              </w:rPr>
+              <w:t>0</w:t>
+            </w:r>
+          </w:p>
+        </w:tc>
+        <w:tc>
+          <w:tcPr>
+            <w:tcW w:type="dxa" w:w="2828"/>
+          </w:tcPr>
+          <w:p>
+            <w:r>
+              <w:rPr>
+                <w:sz w:val="16"/>
+              </w:rPr>
+              <w:t>0</w:t>
+            </w:r>
+          </w:p>
+        </w:tc>
+        <w:tc>
+          <w:tcPr>
+            <w:tcW w:type="dxa" w:w="2828"/>
+          </w:tcPr>
+          <w:p>
+            <w:r>
+              <w:rPr>
+                <w:sz w:val="16"/>
+              </w:rPr>
+              <w:t>0</w:t>
+            </w:r>
+          </w:p>
+        </w:tc>
+      </w:tr>
+    </w:tbl>
+    <w:p>
+      <w:r>
+        <w:rPr>
+          <w:i/>
+          <w:sz w:val="16"/>
+        </w:rPr>
+        <w:t>Dihitung dari kolom akses_baseline dan akses_sedang pada thesis_grid_results.csv.gz terkunci.</w:t>
+      </w:r>
+    </w:p>
+    <w:p>
+      <w:pPr>
+        <w:pStyle w:val="Heading2"/>
+      </w:pPr>
+      <w:r>
         <w:t>L01. Lampiran: metrik pendukung pemilihan K (tidak dipakai memilih)</w:t>
       </w:r>
     </w:p>
@@ -24882,28 +25330,29 @@
         <w:tblLook w:firstColumn="1" w:firstRow="1" w:lastColumn="0" w:lastRow="0" w:noHBand="0" w:noVBand="1" w:val="04A0"/>
       </w:tblPr>
       <w:tblGrid>
-        <w:gridCol w:w="832"/>
-        <w:gridCol w:w="832"/>
-        <w:gridCol w:w="832"/>
-        <w:gridCol w:w="832"/>
-        <w:gridCol w:w="832"/>
-        <w:gridCol w:w="832"/>
-        <w:gridCol w:w="832"/>
-        <w:gridCol w:w="832"/>
-        <w:gridCol w:w="832"/>
-        <w:gridCol w:w="832"/>
-        <w:gridCol w:w="832"/>
-        <w:gridCol w:w="832"/>
-        <w:gridCol w:w="832"/>
-        <w:gridCol w:w="832"/>
-        <w:gridCol w:w="832"/>
-        <w:gridCol w:w="832"/>
-        <w:gridCol w:w="832"/>
+        <w:gridCol w:w="786"/>
+        <w:gridCol w:w="786"/>
+        <w:gridCol w:w="786"/>
+        <w:gridCol w:w="786"/>
+        <w:gridCol w:w="786"/>
+        <w:gridCol w:w="786"/>
+        <w:gridCol w:w="786"/>
+        <w:gridCol w:w="786"/>
+        <w:gridCol w:w="786"/>
+        <w:gridCol w:w="786"/>
+        <w:gridCol w:w="786"/>
+        <w:gridCol w:w="786"/>
+        <w:gridCol w:w="786"/>
+        <w:gridCol w:w="786"/>
+        <w:gridCol w:w="786"/>
+        <w:gridCol w:w="786"/>
+        <w:gridCol w:w="786"/>
+        <w:gridCol w:w="786"/>
       </w:tblGrid>
       <w:tr>
         <w:tc>
           <w:tcPr>
-            <w:tcW w:type="dxa" w:w="832"/>
+            <w:tcW w:type="dxa" w:w="786"/>
           </w:tcPr>
           <w:p>
             <w:r>
@@ -24917,7 +25366,7 @@
         </w:tc>
         <w:tc>
           <w:tcPr>
-            <w:tcW w:type="dxa" w:w="832"/>
+            <w:tcW w:type="dxa" w:w="786"/>
           </w:tcPr>
           <w:p>
             <w:r>
@@ -24931,7 +25380,7 @@
         </w:tc>
         <w:tc>
           <w:tcPr>
-            <w:tcW w:type="dxa" w:w="832"/>
+            <w:tcW w:type="dxa" w:w="786"/>
           </w:tcPr>
           <w:p>
             <w:r>
@@ -24945,7 +25394,7 @@
         </w:tc>
         <w:tc>
           <w:tcPr>
-            <w:tcW w:type="dxa" w:w="832"/>
+            <w:tcW w:type="dxa" w:w="786"/>
           </w:tcPr>
           <w:p>
             <w:r>
@@ -24959,7 +25408,7 @@
         </w:tc>
         <w:tc>
           <w:tcPr>
-            <w:tcW w:type="dxa" w:w="832"/>
+            <w:tcW w:type="dxa" w:w="786"/>
           </w:tcPr>
           <w:p>
             <w:r>
@@ -24973,7 +25422,7 @@
         </w:tc>
         <w:tc>
           <w:tcPr>
-            <w:tcW w:type="dxa" w:w="832"/>
+            <w:tcW w:type="dxa" w:w="786"/>
           </w:tcPr>
           <w:p>
             <w:r>
@@ -24987,7 +25436,7 @@
         </w:tc>
         <w:tc>
           <w:tcPr>
-            <w:tcW w:type="dxa" w:w="832"/>
+            <w:tcW w:type="dxa" w:w="786"/>
           </w:tcPr>
           <w:p>
             <w:r>
@@ -25001,7 +25450,7 @@
         </w:tc>
         <w:tc>
           <w:tcPr>
-            <w:tcW w:type="dxa" w:w="832"/>
+            <w:tcW w:type="dxa" w:w="786"/>
           </w:tcPr>
           <w:p>
             <w:r>
@@ -25015,7 +25464,7 @@
         </w:tc>
         <w:tc>
           <w:tcPr>
-            <w:tcW w:type="dxa" w:w="832"/>
+            <w:tcW w:type="dxa" w:w="786"/>
           </w:tcPr>
           <w:p>
             <w:r>
@@ -25029,7 +25478,7 @@
         </w:tc>
         <w:tc>
           <w:tcPr>
-            <w:tcW w:type="dxa" w:w="832"/>
+            <w:tcW w:type="dxa" w:w="786"/>
           </w:tcPr>
           <w:p>
             <w:r>
@@ -25043,7 +25492,7 @@
         </w:tc>
         <w:tc>
           <w:tcPr>
-            <w:tcW w:type="dxa" w:w="832"/>
+            <w:tcW w:type="dxa" w:w="786"/>
           </w:tcPr>
           <w:p>
             <w:r>
@@ -25057,7 +25506,7 @@
         </w:tc>
         <w:tc>
           <w:tcPr>
-            <w:tcW w:type="dxa" w:w="832"/>
+            <w:tcW w:type="dxa" w:w="786"/>
           </w:tcPr>
           <w:p>
             <w:r>
@@ -25071,7 +25520,7 @@
         </w:tc>
         <w:tc>
           <w:tcPr>
-            <w:tcW w:type="dxa" w:w="832"/>
+            <w:tcW w:type="dxa" w:w="786"/>
           </w:tcPr>
           <w:p>
             <w:r>
@@ -25085,7 +25534,7 @@
         </w:tc>
         <w:tc>
           <w:tcPr>
-            <w:tcW w:type="dxa" w:w="832"/>
+            <w:tcW w:type="dxa" w:w="786"/>
           </w:tcPr>
           <w:p>
             <w:r>
@@ -25099,7 +25548,7 @@
         </w:tc>
         <w:tc>
           <w:tcPr>
-            <w:tcW w:type="dxa" w:w="832"/>
+            <w:tcW w:type="dxa" w:w="786"/>
           </w:tcPr>
           <w:p>
             <w:r>
@@ -25113,7 +25562,7 @@
         </w:tc>
         <w:tc>
           <w:tcPr>
-            <w:tcW w:type="dxa" w:w="832"/>
+            <w:tcW w:type="dxa" w:w="786"/>
           </w:tcPr>
           <w:p>
             <w:r>
@@ -25127,7 +25576,7 @@
         </w:tc>
         <w:tc>
           <w:tcPr>
-            <w:tcW w:type="dxa" w:w="832"/>
+            <w:tcW w:type="dxa" w:w="786"/>
           </w:tcPr>
           <w:p>
             <w:r>
@@ -25136,6 +25585,20 @@
                 <w:sz w:val="16"/>
               </w:rPr>
               <w:t>Galat</w:t>
+            </w:r>
+          </w:p>
+        </w:tc>
+        <w:tc>
+          <w:tcPr>
+            <w:tcW w:type="dxa" w:w="786"/>
+          </w:tcPr>
+          <w:p>
+            <w:r>
+              <w:rPr>
+                <w:b/>
+                <w:sz w:val="16"/>
+              </w:rPr>
+              <w:t>Catatan</w:t>
             </w:r>
           </w:p>
         </w:tc>
@@ -25143,7 +25606,7 @@
       <w:tr>
         <w:tc>
           <w:tcPr>
-            <w:tcW w:type="dxa" w:w="832"/>
+            <w:tcW w:type="dxa" w:w="786"/>
           </w:tcPr>
           <w:p>
             <w:r>
@@ -25156,7 +25619,7 @@
         </w:tc>
         <w:tc>
           <w:tcPr>
-            <w:tcW w:type="dxa" w:w="832"/>
+            <w:tcW w:type="dxa" w:w="786"/>
           </w:tcPr>
           <w:p>
             <w:r>
@@ -25169,7 +25632,7 @@
         </w:tc>
         <w:tc>
           <w:tcPr>
-            <w:tcW w:type="dxa" w:w="832"/>
+            <w:tcW w:type="dxa" w:w="786"/>
           </w:tcPr>
           <w:p>
             <w:r>
@@ -25182,7 +25645,7 @@
         </w:tc>
         <w:tc>
           <w:tcPr>
-            <w:tcW w:type="dxa" w:w="832"/>
+            <w:tcW w:type="dxa" w:w="786"/>
           </w:tcPr>
           <w:p>
             <w:r>
@@ -25195,7 +25658,7 @@
         </w:tc>
         <w:tc>
           <w:tcPr>
-            <w:tcW w:type="dxa" w:w="832"/>
+            <w:tcW w:type="dxa" w:w="786"/>
           </w:tcPr>
           <w:p>
             <w:r>
@@ -25208,7 +25671,7 @@
         </w:tc>
         <w:tc>
           <w:tcPr>
-            <w:tcW w:type="dxa" w:w="832"/>
+            <w:tcW w:type="dxa" w:w="786"/>
           </w:tcPr>
           <w:p>
             <w:r>
@@ -25221,7 +25684,7 @@
         </w:tc>
         <w:tc>
           <w:tcPr>
-            <w:tcW w:type="dxa" w:w="832"/>
+            <w:tcW w:type="dxa" w:w="786"/>
           </w:tcPr>
           <w:p>
             <w:r>
@@ -25234,7 +25697,7 @@
         </w:tc>
         <w:tc>
           <w:tcPr>
-            <w:tcW w:type="dxa" w:w="832"/>
+            <w:tcW w:type="dxa" w:w="786"/>
           </w:tcPr>
           <w:p>
             <w:r>
@@ -25247,7 +25710,7 @@
         </w:tc>
         <w:tc>
           <w:tcPr>
-            <w:tcW w:type="dxa" w:w="832"/>
+            <w:tcW w:type="dxa" w:w="786"/>
           </w:tcPr>
           <w:p>
             <w:r>
@@ -25260,7 +25723,7 @@
         </w:tc>
         <w:tc>
           <w:tcPr>
-            <w:tcW w:type="dxa" w:w="832"/>
+            <w:tcW w:type="dxa" w:w="786"/>
           </w:tcPr>
           <w:p>
             <w:r>
@@ -25273,7 +25736,7 @@
         </w:tc>
         <w:tc>
           <w:tcPr>
-            <w:tcW w:type="dxa" w:w="832"/>
+            <w:tcW w:type="dxa" w:w="786"/>
           </w:tcPr>
           <w:p>
             <w:r>
@@ -25286,7 +25749,7 @@
         </w:tc>
         <w:tc>
           <w:tcPr>
-            <w:tcW w:type="dxa" w:w="832"/>
+            <w:tcW w:type="dxa" w:w="786"/>
           </w:tcPr>
           <w:p>
             <w:r>
@@ -25299,7 +25762,7 @@
         </w:tc>
         <w:tc>
           <w:tcPr>
-            <w:tcW w:type="dxa" w:w="832"/>
+            <w:tcW w:type="dxa" w:w="786"/>
           </w:tcPr>
           <w:p>
             <w:r>
@@ -25312,7 +25775,7 @@
         </w:tc>
         <w:tc>
           <w:tcPr>
-            <w:tcW w:type="dxa" w:w="832"/>
+            <w:tcW w:type="dxa" w:w="786"/>
           </w:tcPr>
           <w:p>
             <w:r>
@@ -25325,7 +25788,7 @@
         </w:tc>
         <w:tc>
           <w:tcPr>
-            <w:tcW w:type="dxa" w:w="832"/>
+            <w:tcW w:type="dxa" w:w="786"/>
           </w:tcPr>
           <w:p>
             <w:r>
@@ -25338,20 +25801,32 @@
         </w:tc>
         <w:tc>
           <w:tcPr>
-            <w:tcW w:type="dxa" w:w="832"/>
-          </w:tcPr>
-          <w:p>
-            <w:r>
-              <w:rPr>
-                <w:sz w:val="16"/>
-              </w:rPr>
-              <w:t>0,23</w:t>
-            </w:r>
-          </w:p>
-        </w:tc>
-        <w:tc>
-          <w:tcPr>
-            <w:tcW w:type="dxa" w:w="832"/>
+            <w:tcW w:type="dxa" w:w="786"/>
+          </w:tcPr>
+          <w:p>
+            <w:r>
+              <w:rPr>
+                <w:sz w:val="16"/>
+              </w:rPr>
+              <w:t>0,24</w:t>
+            </w:r>
+          </w:p>
+        </w:tc>
+        <w:tc>
+          <w:tcPr>
+            <w:tcW w:type="dxa" w:w="786"/>
+          </w:tcPr>
+          <w:p>
+            <w:r>
+              <w:rPr>
+                <w:sz w:val="16"/>
+              </w:rPr>
+            </w:r>
+          </w:p>
+        </w:tc>
+        <w:tc>
+          <w:tcPr>
+            <w:tcW w:type="dxa" w:w="786"/>
           </w:tcPr>
           <w:p>
             <w:r>
@@ -25365,7 +25840,7 @@
       <w:tr>
         <w:tc>
           <w:tcPr>
-            <w:tcW w:type="dxa" w:w="832"/>
+            <w:tcW w:type="dxa" w:w="786"/>
           </w:tcPr>
           <w:p>
             <w:r>
@@ -25378,7 +25853,7 @@
         </w:tc>
         <w:tc>
           <w:tcPr>
-            <w:tcW w:type="dxa" w:w="832"/>
+            <w:tcW w:type="dxa" w:w="786"/>
           </w:tcPr>
           <w:p>
             <w:r>
@@ -25391,7 +25866,7 @@
         </w:tc>
         <w:tc>
           <w:tcPr>
-            <w:tcW w:type="dxa" w:w="832"/>
+            <w:tcW w:type="dxa" w:w="786"/>
           </w:tcPr>
           <w:p>
             <w:r>
@@ -25404,7 +25879,7 @@
         </w:tc>
         <w:tc>
           <w:tcPr>
-            <w:tcW w:type="dxa" w:w="832"/>
+            <w:tcW w:type="dxa" w:w="786"/>
           </w:tcPr>
           <w:p>
             <w:r>
@@ -25417,7 +25892,7 @@
         </w:tc>
         <w:tc>
           <w:tcPr>
-            <w:tcW w:type="dxa" w:w="832"/>
+            <w:tcW w:type="dxa" w:w="786"/>
           </w:tcPr>
           <w:p>
             <w:r>
@@ -25430,7 +25905,7 @@
         </w:tc>
         <w:tc>
           <w:tcPr>
-            <w:tcW w:type="dxa" w:w="832"/>
+            <w:tcW w:type="dxa" w:w="786"/>
           </w:tcPr>
           <w:p>
             <w:r>
@@ -25443,7 +25918,7 @@
         </w:tc>
         <w:tc>
           <w:tcPr>
-            <w:tcW w:type="dxa" w:w="832"/>
+            <w:tcW w:type="dxa" w:w="786"/>
           </w:tcPr>
           <w:p>
             <w:r>
@@ -25456,7 +25931,7 @@
         </w:tc>
         <w:tc>
           <w:tcPr>
-            <w:tcW w:type="dxa" w:w="832"/>
+            <w:tcW w:type="dxa" w:w="786"/>
           </w:tcPr>
           <w:p>
             <w:r>
@@ -25469,7 +25944,7 @@
         </w:tc>
         <w:tc>
           <w:tcPr>
-            <w:tcW w:type="dxa" w:w="832"/>
+            <w:tcW w:type="dxa" w:w="786"/>
           </w:tcPr>
           <w:p>
             <w:r>
@@ -25482,7 +25957,7 @@
         </w:tc>
         <w:tc>
           <w:tcPr>
-            <w:tcW w:type="dxa" w:w="832"/>
+            <w:tcW w:type="dxa" w:w="786"/>
           </w:tcPr>
           <w:p>
             <w:r>
@@ -25495,7 +25970,7 @@
         </w:tc>
         <w:tc>
           <w:tcPr>
-            <w:tcW w:type="dxa" w:w="832"/>
+            <w:tcW w:type="dxa" w:w="786"/>
           </w:tcPr>
           <w:p>
             <w:r>
@@ -25508,7 +25983,7 @@
         </w:tc>
         <w:tc>
           <w:tcPr>
-            <w:tcW w:type="dxa" w:w="832"/>
+            <w:tcW w:type="dxa" w:w="786"/>
           </w:tcPr>
           <w:p>
             <w:r>
@@ -25521,7 +25996,7 @@
         </w:tc>
         <w:tc>
           <w:tcPr>
-            <w:tcW w:type="dxa" w:w="832"/>
+            <w:tcW w:type="dxa" w:w="786"/>
           </w:tcPr>
           <w:p>
             <w:r>
@@ -25534,7 +26009,7 @@
         </w:tc>
         <w:tc>
           <w:tcPr>
-            <w:tcW w:type="dxa" w:w="832"/>
+            <w:tcW w:type="dxa" w:w="786"/>
           </w:tcPr>
           <w:p>
             <w:r>
@@ -25547,7 +26022,7 @@
         </w:tc>
         <w:tc>
           <w:tcPr>
-            <w:tcW w:type="dxa" w:w="832"/>
+            <w:tcW w:type="dxa" w:w="786"/>
           </w:tcPr>
           <w:p>
             <w:r>
@@ -25560,7 +26035,7 @@
         </w:tc>
         <w:tc>
           <w:tcPr>
-            <w:tcW w:type="dxa" w:w="832"/>
+            <w:tcW w:type="dxa" w:w="786"/>
           </w:tcPr>
           <w:p>
             <w:r>
@@ -25573,7 +26048,19 @@
         </w:tc>
         <w:tc>
           <w:tcPr>
-            <w:tcW w:type="dxa" w:w="832"/>
+            <w:tcW w:type="dxa" w:w="786"/>
+          </w:tcPr>
+          <w:p>
+            <w:r>
+              <w:rPr>
+                <w:sz w:val="16"/>
+              </w:rPr>
+            </w:r>
+          </w:p>
+        </w:tc>
+        <w:tc>
+          <w:tcPr>
+            <w:tcW w:type="dxa" w:w="786"/>
           </w:tcPr>
           <w:p>
             <w:r>
@@ -25587,7 +26074,7 @@
       <w:tr>
         <w:tc>
           <w:tcPr>
-            <w:tcW w:type="dxa" w:w="832"/>
+            <w:tcW w:type="dxa" w:w="786"/>
           </w:tcPr>
           <w:p>
             <w:r>
@@ -25600,7 +26087,7 @@
         </w:tc>
         <w:tc>
           <w:tcPr>
-            <w:tcW w:type="dxa" w:w="832"/>
+            <w:tcW w:type="dxa" w:w="786"/>
           </w:tcPr>
           <w:p>
             <w:r>
@@ -25613,7 +26100,7 @@
         </w:tc>
         <w:tc>
           <w:tcPr>
-            <w:tcW w:type="dxa" w:w="832"/>
+            <w:tcW w:type="dxa" w:w="786"/>
           </w:tcPr>
           <w:p>
             <w:r>
@@ -25626,7 +26113,7 @@
         </w:tc>
         <w:tc>
           <w:tcPr>
-            <w:tcW w:type="dxa" w:w="832"/>
+            <w:tcW w:type="dxa" w:w="786"/>
           </w:tcPr>
           <w:p>
             <w:r>
@@ -25639,7 +26126,7 @@
         </w:tc>
         <w:tc>
           <w:tcPr>
-            <w:tcW w:type="dxa" w:w="832"/>
+            <w:tcW w:type="dxa" w:w="786"/>
           </w:tcPr>
           <w:p>
             <w:r>
@@ -25652,7 +26139,7 @@
         </w:tc>
         <w:tc>
           <w:tcPr>
-            <w:tcW w:type="dxa" w:w="832"/>
+            <w:tcW w:type="dxa" w:w="786"/>
           </w:tcPr>
           <w:p>
             <w:r>
@@ -25665,7 +26152,7 @@
         </w:tc>
         <w:tc>
           <w:tcPr>
-            <w:tcW w:type="dxa" w:w="832"/>
+            <w:tcW w:type="dxa" w:w="786"/>
           </w:tcPr>
           <w:p>
             <w:r>
@@ -25678,7 +26165,7 @@
         </w:tc>
         <w:tc>
           <w:tcPr>
-            <w:tcW w:type="dxa" w:w="832"/>
+            <w:tcW w:type="dxa" w:w="786"/>
           </w:tcPr>
           <w:p>
             <w:r>
@@ -25691,7 +26178,7 @@
         </w:tc>
         <w:tc>
           <w:tcPr>
-            <w:tcW w:type="dxa" w:w="832"/>
+            <w:tcW w:type="dxa" w:w="786"/>
           </w:tcPr>
           <w:p>
             <w:r>
@@ -25704,7 +26191,7 @@
         </w:tc>
         <w:tc>
           <w:tcPr>
-            <w:tcW w:type="dxa" w:w="832"/>
+            <w:tcW w:type="dxa" w:w="786"/>
           </w:tcPr>
           <w:p>
             <w:r>
@@ -25717,7 +26204,7 @@
         </w:tc>
         <w:tc>
           <w:tcPr>
-            <w:tcW w:type="dxa" w:w="832"/>
+            <w:tcW w:type="dxa" w:w="786"/>
           </w:tcPr>
           <w:p>
             <w:r>
@@ -25730,7 +26217,7 @@
         </w:tc>
         <w:tc>
           <w:tcPr>
-            <w:tcW w:type="dxa" w:w="832"/>
+            <w:tcW w:type="dxa" w:w="786"/>
           </w:tcPr>
           <w:p>
             <w:r>
@@ -25743,7 +26230,7 @@
         </w:tc>
         <w:tc>
           <w:tcPr>
-            <w:tcW w:type="dxa" w:w="832"/>
+            <w:tcW w:type="dxa" w:w="786"/>
           </w:tcPr>
           <w:p>
             <w:r>
@@ -25756,7 +26243,7 @@
         </w:tc>
         <w:tc>
           <w:tcPr>
-            <w:tcW w:type="dxa" w:w="832"/>
+            <w:tcW w:type="dxa" w:w="786"/>
           </w:tcPr>
           <w:p>
             <w:r>
@@ -25769,7 +26256,7 @@
         </w:tc>
         <w:tc>
           <w:tcPr>
-            <w:tcW w:type="dxa" w:w="832"/>
+            <w:tcW w:type="dxa" w:w="786"/>
           </w:tcPr>
           <w:p>
             <w:r>
@@ -25782,20 +26269,32 @@
         </w:tc>
         <w:tc>
           <w:tcPr>
-            <w:tcW w:type="dxa" w:w="832"/>
-          </w:tcPr>
-          <w:p>
-            <w:r>
-              <w:rPr>
-                <w:sz w:val="16"/>
-              </w:rPr>
-              <w:t>0,25</w:t>
-            </w:r>
-          </w:p>
-        </w:tc>
-        <w:tc>
-          <w:tcPr>
-            <w:tcW w:type="dxa" w:w="832"/>
+            <w:tcW w:type="dxa" w:w="786"/>
+          </w:tcPr>
+          <w:p>
+            <w:r>
+              <w:rPr>
+                <w:sz w:val="16"/>
+              </w:rPr>
+              <w:t>0,26</w:t>
+            </w:r>
+          </w:p>
+        </w:tc>
+        <w:tc>
+          <w:tcPr>
+            <w:tcW w:type="dxa" w:w="786"/>
+          </w:tcPr>
+          <w:p>
+            <w:r>
+              <w:rPr>
+                <w:sz w:val="16"/>
+              </w:rPr>
+            </w:r>
+          </w:p>
+        </w:tc>
+        <w:tc>
+          <w:tcPr>
+            <w:tcW w:type="dxa" w:w="786"/>
           </w:tcPr>
           <w:p>
             <w:r>
@@ -25809,7 +26308,7 @@
       <w:tr>
         <w:tc>
           <w:tcPr>
-            <w:tcW w:type="dxa" w:w="832"/>
+            <w:tcW w:type="dxa" w:w="786"/>
           </w:tcPr>
           <w:p>
             <w:r>
@@ -25822,7 +26321,7 @@
         </w:tc>
         <w:tc>
           <w:tcPr>
-            <w:tcW w:type="dxa" w:w="832"/>
+            <w:tcW w:type="dxa" w:w="786"/>
           </w:tcPr>
           <w:p>
             <w:r>
@@ -25835,7 +26334,7 @@
         </w:tc>
         <w:tc>
           <w:tcPr>
-            <w:tcW w:type="dxa" w:w="832"/>
+            <w:tcW w:type="dxa" w:w="786"/>
           </w:tcPr>
           <w:p>
             <w:r>
@@ -25848,7 +26347,7 @@
         </w:tc>
         <w:tc>
           <w:tcPr>
-            <w:tcW w:type="dxa" w:w="832"/>
+            <w:tcW w:type="dxa" w:w="786"/>
           </w:tcPr>
           <w:p>
             <w:r>
@@ -25861,7 +26360,7 @@
         </w:tc>
         <w:tc>
           <w:tcPr>
-            <w:tcW w:type="dxa" w:w="832"/>
+            <w:tcW w:type="dxa" w:w="786"/>
           </w:tcPr>
           <w:p>
             <w:r>
@@ -25874,7 +26373,7 @@
         </w:tc>
         <w:tc>
           <w:tcPr>
-            <w:tcW w:type="dxa" w:w="832"/>
+            <w:tcW w:type="dxa" w:w="786"/>
           </w:tcPr>
           <w:p>
             <w:r>
@@ -25887,7 +26386,7 @@
         </w:tc>
         <w:tc>
           <w:tcPr>
-            <w:tcW w:type="dxa" w:w="832"/>
+            <w:tcW w:type="dxa" w:w="786"/>
           </w:tcPr>
           <w:p>
             <w:r>
@@ -25900,7 +26399,7 @@
         </w:tc>
         <w:tc>
           <w:tcPr>
-            <w:tcW w:type="dxa" w:w="832"/>
+            <w:tcW w:type="dxa" w:w="786"/>
           </w:tcPr>
           <w:p>
             <w:r>
@@ -25913,7 +26412,7 @@
         </w:tc>
         <w:tc>
           <w:tcPr>
-            <w:tcW w:type="dxa" w:w="832"/>
+            <w:tcW w:type="dxa" w:w="786"/>
           </w:tcPr>
           <w:p>
             <w:r>
@@ -25926,7 +26425,7 @@
         </w:tc>
         <w:tc>
           <w:tcPr>
-            <w:tcW w:type="dxa" w:w="832"/>
+            <w:tcW w:type="dxa" w:w="786"/>
           </w:tcPr>
           <w:p>
             <w:r>
@@ -25939,7 +26438,7 @@
         </w:tc>
         <w:tc>
           <w:tcPr>
-            <w:tcW w:type="dxa" w:w="832"/>
+            <w:tcW w:type="dxa" w:w="786"/>
           </w:tcPr>
           <w:p>
             <w:r>
@@ -25952,7 +26451,7 @@
         </w:tc>
         <w:tc>
           <w:tcPr>
-            <w:tcW w:type="dxa" w:w="832"/>
+            <w:tcW w:type="dxa" w:w="786"/>
           </w:tcPr>
           <w:p>
             <w:r>
@@ -25965,7 +26464,7 @@
         </w:tc>
         <w:tc>
           <w:tcPr>
-            <w:tcW w:type="dxa" w:w="832"/>
+            <w:tcW w:type="dxa" w:w="786"/>
           </w:tcPr>
           <w:p>
             <w:r>
@@ -25978,7 +26477,7 @@
         </w:tc>
         <w:tc>
           <w:tcPr>
-            <w:tcW w:type="dxa" w:w="832"/>
+            <w:tcW w:type="dxa" w:w="786"/>
           </w:tcPr>
           <w:p>
             <w:r>
@@ -25991,7 +26490,7 @@
         </w:tc>
         <w:tc>
           <w:tcPr>
-            <w:tcW w:type="dxa" w:w="832"/>
+            <w:tcW w:type="dxa" w:w="786"/>
           </w:tcPr>
           <w:p>
             <w:r>
@@ -26004,26 +26503,39 @@
         </w:tc>
         <w:tc>
           <w:tcPr>
-            <w:tcW w:type="dxa" w:w="832"/>
-          </w:tcPr>
-          <w:p>
-            <w:r>
-              <w:rPr>
-                <w:sz w:val="16"/>
-              </w:rPr>
-              <w:t>22,69</w:t>
-            </w:r>
-          </w:p>
-        </w:tc>
-        <w:tc>
-          <w:tcPr>
-            <w:tcW w:type="dxa" w:w="832"/>
-          </w:tcPr>
-          <w:p>
-            <w:r>
-              <w:rPr>
-                <w:sz w:val="16"/>
-              </w:rPr>
+            <w:tcW w:type="dxa" w:w="786"/>
+          </w:tcPr>
+          <w:p>
+            <w:r>
+              <w:rPr>
+                <w:sz w:val="16"/>
+              </w:rPr>
+              <w:t>22,44</w:t>
+            </w:r>
+          </w:p>
+        </w:tc>
+        <w:tc>
+          <w:tcPr>
+            <w:tcW w:type="dxa" w:w="786"/>
+          </w:tcPr>
+          <w:p>
+            <w:r>
+              <w:rPr>
+                <w:sz w:val="16"/>
+              </w:rPr>
+            </w:r>
+          </w:p>
+        </w:tc>
+        <w:tc>
+          <w:tcPr>
+            <w:tcW w:type="dxa" w:w="786"/>
+          </w:tcPr>
+          <w:p>
+            <w:r>
+              <w:rPr>
+                <w:sz w:val="16"/>
+              </w:rPr>
+              <w:t>degeneratif (klaster terbesar 98,2%; batas 90%)</w:t>
             </w:r>
           </w:p>
         </w:tc>
@@ -26031,7 +26543,7 @@
       <w:tr>
         <w:tc>
           <w:tcPr>
-            <w:tcW w:type="dxa" w:w="832"/>
+            <w:tcW w:type="dxa" w:w="786"/>
           </w:tcPr>
           <w:p>
             <w:r>
@@ -26044,7 +26556,7 @@
         </w:tc>
         <w:tc>
           <w:tcPr>
-            <w:tcW w:type="dxa" w:w="832"/>
+            <w:tcW w:type="dxa" w:w="786"/>
           </w:tcPr>
           <w:p>
             <w:r>
@@ -26057,7 +26569,7 @@
         </w:tc>
         <w:tc>
           <w:tcPr>
-            <w:tcW w:type="dxa" w:w="832"/>
+            <w:tcW w:type="dxa" w:w="786"/>
           </w:tcPr>
           <w:p>
             <w:r>
@@ -26070,7 +26582,7 @@
         </w:tc>
         <w:tc>
           <w:tcPr>
-            <w:tcW w:type="dxa" w:w="832"/>
+            <w:tcW w:type="dxa" w:w="786"/>
           </w:tcPr>
           <w:p>
             <w:r>
@@ -26083,7 +26595,7 @@
         </w:tc>
         <w:tc>
           <w:tcPr>
-            <w:tcW w:type="dxa" w:w="832"/>
+            <w:tcW w:type="dxa" w:w="786"/>
           </w:tcPr>
           <w:p>
             <w:r>
@@ -26096,7 +26608,7 @@
         </w:tc>
         <w:tc>
           <w:tcPr>
-            <w:tcW w:type="dxa" w:w="832"/>
+            <w:tcW w:type="dxa" w:w="786"/>
           </w:tcPr>
           <w:p>
             <w:r>
@@ -26109,7 +26621,7 @@
         </w:tc>
         <w:tc>
           <w:tcPr>
-            <w:tcW w:type="dxa" w:w="832"/>
+            <w:tcW w:type="dxa" w:w="786"/>
           </w:tcPr>
           <w:p>
             <w:r>
@@ -26122,7 +26634,7 @@
         </w:tc>
         <w:tc>
           <w:tcPr>
-            <w:tcW w:type="dxa" w:w="832"/>
+            <w:tcW w:type="dxa" w:w="786"/>
           </w:tcPr>
           <w:p>
             <w:r>
@@ -26135,7 +26647,7 @@
         </w:tc>
         <w:tc>
           <w:tcPr>
-            <w:tcW w:type="dxa" w:w="832"/>
+            <w:tcW w:type="dxa" w:w="786"/>
           </w:tcPr>
           <w:p>
             <w:r>
@@ -26148,7 +26660,7 @@
         </w:tc>
         <w:tc>
           <w:tcPr>
-            <w:tcW w:type="dxa" w:w="832"/>
+            <w:tcW w:type="dxa" w:w="786"/>
           </w:tcPr>
           <w:p>
             <w:r>
@@ -26161,7 +26673,7 @@
         </w:tc>
         <w:tc>
           <w:tcPr>
-            <w:tcW w:type="dxa" w:w="832"/>
+            <w:tcW w:type="dxa" w:w="786"/>
           </w:tcPr>
           <w:p>
             <w:r>
@@ -26174,7 +26686,7 @@
         </w:tc>
         <w:tc>
           <w:tcPr>
-            <w:tcW w:type="dxa" w:w="832"/>
+            <w:tcW w:type="dxa" w:w="786"/>
           </w:tcPr>
           <w:p>
             <w:r>
@@ -26187,7 +26699,7 @@
         </w:tc>
         <w:tc>
           <w:tcPr>
-            <w:tcW w:type="dxa" w:w="832"/>
+            <w:tcW w:type="dxa" w:w="786"/>
           </w:tcPr>
           <w:p>
             <w:r>
@@ -26200,7 +26712,7 @@
         </w:tc>
         <w:tc>
           <w:tcPr>
-            <w:tcW w:type="dxa" w:w="832"/>
+            <w:tcW w:type="dxa" w:w="786"/>
           </w:tcPr>
           <w:p>
             <w:r>
@@ -26213,7 +26725,7 @@
         </w:tc>
         <w:tc>
           <w:tcPr>
-            <w:tcW w:type="dxa" w:w="832"/>
+            <w:tcW w:type="dxa" w:w="786"/>
           </w:tcPr>
           <w:p>
             <w:r>
@@ -26226,20 +26738,20 @@
         </w:tc>
         <w:tc>
           <w:tcPr>
-            <w:tcW w:type="dxa" w:w="832"/>
-          </w:tcPr>
-          <w:p>
-            <w:r>
-              <w:rPr>
-                <w:sz w:val="16"/>
-              </w:rPr>
-              <w:t>7,66</w:t>
-            </w:r>
-          </w:p>
-        </w:tc>
-        <w:tc>
-          <w:tcPr>
-            <w:tcW w:type="dxa" w:w="832"/>
+            <w:tcW w:type="dxa" w:w="786"/>
+          </w:tcPr>
+          <w:p>
+            <w:r>
+              <w:rPr>
+                <w:sz w:val="16"/>
+              </w:rPr>
+              <w:t>6,15</w:t>
+            </w:r>
+          </w:p>
+        </w:tc>
+        <w:tc>
+          <w:tcPr>
+            <w:tcW w:type="dxa" w:w="786"/>
           </w:tcPr>
           <w:p>
             <w:r>
@@ -26247,6 +26759,19 @@
                 <w:sz w:val="16"/>
               </w:rPr>
               <w:t>ValueError: Islands must be larger than the quorum. If not, drop the small islands and solve for clusters in the remaining field.</w:t>
+            </w:r>
+          </w:p>
+        </w:tc>
+        <w:tc>
+          <w:tcPr>
+            <w:tcW w:type="dxa" w:w="786"/>
+          </w:tcPr>
+          <w:p>
+            <w:r>
+              <w:rPr>
+                <w:sz w:val="16"/>
+              </w:rPr>
+              <w:t>gagal dijalankan; tidak layak dibandingkan</w:t>
             </w:r>
           </w:p>
         </w:tc>
@@ -26276,28 +26801,29 @@
         <w:tblLook w:firstColumn="1" w:firstRow="1" w:lastColumn="0" w:lastRow="0" w:noHBand="0" w:noVBand="1" w:val="04A0"/>
       </w:tblPr>
       <w:tblGrid>
-        <w:gridCol w:w="832"/>
-        <w:gridCol w:w="832"/>
-        <w:gridCol w:w="832"/>
-        <w:gridCol w:w="832"/>
-        <w:gridCol w:w="832"/>
-        <w:gridCol w:w="832"/>
-        <w:gridCol w:w="832"/>
-        <w:gridCol w:w="832"/>
-        <w:gridCol w:w="832"/>
-        <w:gridCol w:w="832"/>
-        <w:gridCol w:w="832"/>
-        <w:gridCol w:w="832"/>
-        <w:gridCol w:w="832"/>
-        <w:gridCol w:w="832"/>
-        <w:gridCol w:w="832"/>
-        <w:gridCol w:w="832"/>
-        <w:gridCol w:w="832"/>
+        <w:gridCol w:w="786"/>
+        <w:gridCol w:w="786"/>
+        <w:gridCol w:w="786"/>
+        <w:gridCol w:w="786"/>
+        <w:gridCol w:w="786"/>
+        <w:gridCol w:w="786"/>
+        <w:gridCol w:w="786"/>
+        <w:gridCol w:w="786"/>
+        <w:gridCol w:w="786"/>
+        <w:gridCol w:w="786"/>
+        <w:gridCol w:w="786"/>
+        <w:gridCol w:w="786"/>
+        <w:gridCol w:w="786"/>
+        <w:gridCol w:w="786"/>
+        <w:gridCol w:w="786"/>
+        <w:gridCol w:w="786"/>
+        <w:gridCol w:w="786"/>
+        <w:gridCol w:w="786"/>
       </w:tblGrid>
       <w:tr>
         <w:tc>
           <w:tcPr>
-            <w:tcW w:type="dxa" w:w="832"/>
+            <w:tcW w:type="dxa" w:w="786"/>
           </w:tcPr>
           <w:p>
             <w:r>
@@ -26311,7 +26837,7 @@
         </w:tc>
         <w:tc>
           <w:tcPr>
-            <w:tcW w:type="dxa" w:w="832"/>
+            <w:tcW w:type="dxa" w:w="786"/>
           </w:tcPr>
           <w:p>
             <w:r>
@@ -26325,7 +26851,7 @@
         </w:tc>
         <w:tc>
           <w:tcPr>
-            <w:tcW w:type="dxa" w:w="832"/>
+            <w:tcW w:type="dxa" w:w="786"/>
           </w:tcPr>
           <w:p>
             <w:r>
@@ -26339,7 +26865,7 @@
         </w:tc>
         <w:tc>
           <w:tcPr>
-            <w:tcW w:type="dxa" w:w="832"/>
+            <w:tcW w:type="dxa" w:w="786"/>
           </w:tcPr>
           <w:p>
             <w:r>
@@ -26353,7 +26879,7 @@
         </w:tc>
         <w:tc>
           <w:tcPr>
-            <w:tcW w:type="dxa" w:w="832"/>
+            <w:tcW w:type="dxa" w:w="786"/>
           </w:tcPr>
           <w:p>
             <w:r>
@@ -26367,7 +26893,7 @@
         </w:tc>
         <w:tc>
           <w:tcPr>
-            <w:tcW w:type="dxa" w:w="832"/>
+            <w:tcW w:type="dxa" w:w="786"/>
           </w:tcPr>
           <w:p>
             <w:r>
@@ -26381,7 +26907,7 @@
         </w:tc>
         <w:tc>
           <w:tcPr>
-            <w:tcW w:type="dxa" w:w="832"/>
+            <w:tcW w:type="dxa" w:w="786"/>
           </w:tcPr>
           <w:p>
             <w:r>
@@ -26395,7 +26921,7 @@
         </w:tc>
         <w:tc>
           <w:tcPr>
-            <w:tcW w:type="dxa" w:w="832"/>
+            <w:tcW w:type="dxa" w:w="786"/>
           </w:tcPr>
           <w:p>
             <w:r>
@@ -26409,7 +26935,7 @@
         </w:tc>
         <w:tc>
           <w:tcPr>
-            <w:tcW w:type="dxa" w:w="832"/>
+            <w:tcW w:type="dxa" w:w="786"/>
           </w:tcPr>
           <w:p>
             <w:r>
@@ -26423,7 +26949,7 @@
         </w:tc>
         <w:tc>
           <w:tcPr>
-            <w:tcW w:type="dxa" w:w="832"/>
+            <w:tcW w:type="dxa" w:w="786"/>
           </w:tcPr>
           <w:p>
             <w:r>
@@ -26437,7 +26963,7 @@
         </w:tc>
         <w:tc>
           <w:tcPr>
-            <w:tcW w:type="dxa" w:w="832"/>
+            <w:tcW w:type="dxa" w:w="786"/>
           </w:tcPr>
           <w:p>
             <w:r>
@@ -26451,7 +26977,7 @@
         </w:tc>
         <w:tc>
           <w:tcPr>
-            <w:tcW w:type="dxa" w:w="832"/>
+            <w:tcW w:type="dxa" w:w="786"/>
           </w:tcPr>
           <w:p>
             <w:r>
@@ -26465,7 +26991,7 @@
         </w:tc>
         <w:tc>
           <w:tcPr>
-            <w:tcW w:type="dxa" w:w="832"/>
+            <w:tcW w:type="dxa" w:w="786"/>
           </w:tcPr>
           <w:p>
             <w:r>
@@ -26479,7 +27005,7 @@
         </w:tc>
         <w:tc>
           <w:tcPr>
-            <w:tcW w:type="dxa" w:w="832"/>
+            <w:tcW w:type="dxa" w:w="786"/>
           </w:tcPr>
           <w:p>
             <w:r>
@@ -26493,7 +27019,7 @@
         </w:tc>
         <w:tc>
           <w:tcPr>
-            <w:tcW w:type="dxa" w:w="832"/>
+            <w:tcW w:type="dxa" w:w="786"/>
           </w:tcPr>
           <w:p>
             <w:r>
@@ -26507,7 +27033,7 @@
         </w:tc>
         <w:tc>
           <w:tcPr>
-            <w:tcW w:type="dxa" w:w="832"/>
+            <w:tcW w:type="dxa" w:w="786"/>
           </w:tcPr>
           <w:p>
             <w:r>
@@ -26521,7 +27047,7 @@
         </w:tc>
         <w:tc>
           <w:tcPr>
-            <w:tcW w:type="dxa" w:w="832"/>
+            <w:tcW w:type="dxa" w:w="786"/>
           </w:tcPr>
           <w:p>
             <w:r>
@@ -26530,6 +27056,20 @@
                 <w:sz w:val="16"/>
               </w:rPr>
               <w:t>Galat</w:t>
+            </w:r>
+          </w:p>
+        </w:tc>
+        <w:tc>
+          <w:tcPr>
+            <w:tcW w:type="dxa" w:w="786"/>
+          </w:tcPr>
+          <w:p>
+            <w:r>
+              <w:rPr>
+                <w:b/>
+                <w:sz w:val="16"/>
+              </w:rPr>
+              <w:t>Catatan</w:t>
             </w:r>
           </w:p>
         </w:tc>
@@ -26537,7 +27077,7 @@
       <w:tr>
         <w:tc>
           <w:tcPr>
-            <w:tcW w:type="dxa" w:w="832"/>
+            <w:tcW w:type="dxa" w:w="786"/>
           </w:tcPr>
           <w:p>
             <w:r>
@@ -26550,7 +27090,7 @@
         </w:tc>
         <w:tc>
           <w:tcPr>
-            <w:tcW w:type="dxa" w:w="832"/>
+            <w:tcW w:type="dxa" w:w="786"/>
           </w:tcPr>
           <w:p>
             <w:r>
@@ -26563,7 +27103,7 @@
         </w:tc>
         <w:tc>
           <w:tcPr>
-            <w:tcW w:type="dxa" w:w="832"/>
+            <w:tcW w:type="dxa" w:w="786"/>
           </w:tcPr>
           <w:p>
             <w:r>
@@ -26576,7 +27116,7 @@
         </w:tc>
         <w:tc>
           <w:tcPr>
-            <w:tcW w:type="dxa" w:w="832"/>
+            <w:tcW w:type="dxa" w:w="786"/>
           </w:tcPr>
           <w:p>
             <w:r>
@@ -26589,7 +27129,7 @@
         </w:tc>
         <w:tc>
           <w:tcPr>
-            <w:tcW w:type="dxa" w:w="832"/>
+            <w:tcW w:type="dxa" w:w="786"/>
           </w:tcPr>
           <w:p>
             <w:r>
@@ -26602,7 +27142,7 @@
         </w:tc>
         <w:tc>
           <w:tcPr>
-            <w:tcW w:type="dxa" w:w="832"/>
+            <w:tcW w:type="dxa" w:w="786"/>
           </w:tcPr>
           <w:p>
             <w:r>
@@ -26615,7 +27155,7 @@
         </w:tc>
         <w:tc>
           <w:tcPr>
-            <w:tcW w:type="dxa" w:w="832"/>
+            <w:tcW w:type="dxa" w:w="786"/>
           </w:tcPr>
           <w:p>
             <w:r>
@@ -26628,7 +27168,7 @@
         </w:tc>
         <w:tc>
           <w:tcPr>
-            <w:tcW w:type="dxa" w:w="832"/>
+            <w:tcW w:type="dxa" w:w="786"/>
           </w:tcPr>
           <w:p>
             <w:r>
@@ -26641,7 +27181,7 @@
         </w:tc>
         <w:tc>
           <w:tcPr>
-            <w:tcW w:type="dxa" w:w="832"/>
+            <w:tcW w:type="dxa" w:w="786"/>
           </w:tcPr>
           <w:p>
             <w:r>
@@ -26654,7 +27194,7 @@
         </w:tc>
         <w:tc>
           <w:tcPr>
-            <w:tcW w:type="dxa" w:w="832"/>
+            <w:tcW w:type="dxa" w:w="786"/>
           </w:tcPr>
           <w:p>
             <w:r>
@@ -26667,7 +27207,7 @@
         </w:tc>
         <w:tc>
           <w:tcPr>
-            <w:tcW w:type="dxa" w:w="832"/>
+            <w:tcW w:type="dxa" w:w="786"/>
           </w:tcPr>
           <w:p>
             <w:r>
@@ -26680,7 +27220,7 @@
         </w:tc>
         <w:tc>
           <w:tcPr>
-            <w:tcW w:type="dxa" w:w="832"/>
+            <w:tcW w:type="dxa" w:w="786"/>
           </w:tcPr>
           <w:p>
             <w:r>
@@ -26693,7 +27233,7 @@
         </w:tc>
         <w:tc>
           <w:tcPr>
-            <w:tcW w:type="dxa" w:w="832"/>
+            <w:tcW w:type="dxa" w:w="786"/>
           </w:tcPr>
           <w:p>
             <w:r>
@@ -26706,7 +27246,7 @@
         </w:tc>
         <w:tc>
           <w:tcPr>
-            <w:tcW w:type="dxa" w:w="832"/>
+            <w:tcW w:type="dxa" w:w="786"/>
           </w:tcPr>
           <w:p>
             <w:r>
@@ -26719,7 +27259,7 @@
         </w:tc>
         <w:tc>
           <w:tcPr>
-            <w:tcW w:type="dxa" w:w="832"/>
+            <w:tcW w:type="dxa" w:w="786"/>
           </w:tcPr>
           <w:p>
             <w:r>
@@ -26732,20 +27272,32 @@
         </w:tc>
         <w:tc>
           <w:tcPr>
-            <w:tcW w:type="dxa" w:w="832"/>
-          </w:tcPr>
-          <w:p>
-            <w:r>
-              <w:rPr>
-                <w:sz w:val="16"/>
-              </w:rPr>
-              <w:t>1,91</w:t>
-            </w:r>
-          </w:p>
-        </w:tc>
-        <w:tc>
-          <w:tcPr>
-            <w:tcW w:type="dxa" w:w="832"/>
+            <w:tcW w:type="dxa" w:w="786"/>
+          </w:tcPr>
+          <w:p>
+            <w:r>
+              <w:rPr>
+                <w:sz w:val="16"/>
+              </w:rPr>
+              <w:t>1,92</w:t>
+            </w:r>
+          </w:p>
+        </w:tc>
+        <w:tc>
+          <w:tcPr>
+            <w:tcW w:type="dxa" w:w="786"/>
+          </w:tcPr>
+          <w:p>
+            <w:r>
+              <w:rPr>
+                <w:sz w:val="16"/>
+              </w:rPr>
+            </w:r>
+          </w:p>
+        </w:tc>
+        <w:tc>
+          <w:tcPr>
+            <w:tcW w:type="dxa" w:w="786"/>
           </w:tcPr>
           <w:p>
             <w:r>
@@ -26759,7 +27311,7 @@
       <w:tr>
         <w:tc>
           <w:tcPr>
-            <w:tcW w:type="dxa" w:w="832"/>
+            <w:tcW w:type="dxa" w:w="786"/>
           </w:tcPr>
           <w:p>
             <w:r>
@@ -26772,7 +27324,7 @@
         </w:tc>
         <w:tc>
           <w:tcPr>
-            <w:tcW w:type="dxa" w:w="832"/>
+            <w:tcW w:type="dxa" w:w="786"/>
           </w:tcPr>
           <w:p>
             <w:r>
@@ -26785,7 +27337,7 @@
         </w:tc>
         <w:tc>
           <w:tcPr>
-            <w:tcW w:type="dxa" w:w="832"/>
+            <w:tcW w:type="dxa" w:w="786"/>
           </w:tcPr>
           <w:p>
             <w:r>
@@ -26798,7 +27350,7 @@
         </w:tc>
         <w:tc>
           <w:tcPr>
-            <w:tcW w:type="dxa" w:w="832"/>
+            <w:tcW w:type="dxa" w:w="786"/>
           </w:tcPr>
           <w:p>
             <w:r>
@@ -26811,7 +27363,7 @@
         </w:tc>
         <w:tc>
           <w:tcPr>
-            <w:tcW w:type="dxa" w:w="832"/>
+            <w:tcW w:type="dxa" w:w="786"/>
           </w:tcPr>
           <w:p>
             <w:r>
@@ -26824,7 +27376,7 @@
         </w:tc>
         <w:tc>
           <w:tcPr>
-            <w:tcW w:type="dxa" w:w="832"/>
+            <w:tcW w:type="dxa" w:w="786"/>
           </w:tcPr>
           <w:p>
             <w:r>
@@ -26837,7 +27389,7 @@
         </w:tc>
         <w:tc>
           <w:tcPr>
-            <w:tcW w:type="dxa" w:w="832"/>
+            <w:tcW w:type="dxa" w:w="786"/>
           </w:tcPr>
           <w:p>
             <w:r>
@@ -26850,7 +27402,7 @@
         </w:tc>
         <w:tc>
           <w:tcPr>
-            <w:tcW w:type="dxa" w:w="832"/>
+            <w:tcW w:type="dxa" w:w="786"/>
           </w:tcPr>
           <w:p>
             <w:r>
@@ -26863,7 +27415,7 @@
         </w:tc>
         <w:tc>
           <w:tcPr>
-            <w:tcW w:type="dxa" w:w="832"/>
+            <w:tcW w:type="dxa" w:w="786"/>
           </w:tcPr>
           <w:p>
             <w:r>
@@ -26876,7 +27428,7 @@
         </w:tc>
         <w:tc>
           <w:tcPr>
-            <w:tcW w:type="dxa" w:w="832"/>
+            <w:tcW w:type="dxa" w:w="786"/>
           </w:tcPr>
           <w:p>
             <w:r>
@@ -26889,7 +27441,7 @@
         </w:tc>
         <w:tc>
           <w:tcPr>
-            <w:tcW w:type="dxa" w:w="832"/>
+            <w:tcW w:type="dxa" w:w="786"/>
           </w:tcPr>
           <w:p>
             <w:r>
@@ -26902,7 +27454,7 @@
         </w:tc>
         <w:tc>
           <w:tcPr>
-            <w:tcW w:type="dxa" w:w="832"/>
+            <w:tcW w:type="dxa" w:w="786"/>
           </w:tcPr>
           <w:p>
             <w:r>
@@ -26915,7 +27467,7 @@
         </w:tc>
         <w:tc>
           <w:tcPr>
-            <w:tcW w:type="dxa" w:w="832"/>
+            <w:tcW w:type="dxa" w:w="786"/>
           </w:tcPr>
           <w:p>
             <w:r>
@@ -26928,7 +27480,7 @@
         </w:tc>
         <w:tc>
           <w:tcPr>
-            <w:tcW w:type="dxa" w:w="832"/>
+            <w:tcW w:type="dxa" w:w="786"/>
           </w:tcPr>
           <w:p>
             <w:r>
@@ -26941,7 +27493,7 @@
         </w:tc>
         <w:tc>
           <w:tcPr>
-            <w:tcW w:type="dxa" w:w="832"/>
+            <w:tcW w:type="dxa" w:w="786"/>
           </w:tcPr>
           <w:p>
             <w:r>
@@ -26954,7 +27506,7 @@
         </w:tc>
         <w:tc>
           <w:tcPr>
-            <w:tcW w:type="dxa" w:w="832"/>
+            <w:tcW w:type="dxa" w:w="786"/>
           </w:tcPr>
           <w:p>
             <w:r>
@@ -26967,7 +27519,19 @@
         </w:tc>
         <w:tc>
           <w:tcPr>
-            <w:tcW w:type="dxa" w:w="832"/>
+            <w:tcW w:type="dxa" w:w="786"/>
+          </w:tcPr>
+          <w:p>
+            <w:r>
+              <w:rPr>
+                <w:sz w:val="16"/>
+              </w:rPr>
+            </w:r>
+          </w:p>
+        </w:tc>
+        <w:tc>
+          <w:tcPr>
+            <w:tcW w:type="dxa" w:w="786"/>
           </w:tcPr>
           <w:p>
             <w:r>
@@ -26981,7 +27545,7 @@
       <w:tr>
         <w:tc>
           <w:tcPr>
-            <w:tcW w:type="dxa" w:w="832"/>
+            <w:tcW w:type="dxa" w:w="786"/>
           </w:tcPr>
           <w:p>
             <w:r>
@@ -26994,7 +27558,7 @@
         </w:tc>
         <w:tc>
           <w:tcPr>
-            <w:tcW w:type="dxa" w:w="832"/>
+            <w:tcW w:type="dxa" w:w="786"/>
           </w:tcPr>
           <w:p>
             <w:r>
@@ -27007,7 +27571,7 @@
         </w:tc>
         <w:tc>
           <w:tcPr>
-            <w:tcW w:type="dxa" w:w="832"/>
+            <w:tcW w:type="dxa" w:w="786"/>
           </w:tcPr>
           <w:p>
             <w:r>
@@ -27020,7 +27584,7 @@
         </w:tc>
         <w:tc>
           <w:tcPr>
-            <w:tcW w:type="dxa" w:w="832"/>
+            <w:tcW w:type="dxa" w:w="786"/>
           </w:tcPr>
           <w:p>
             <w:r>
@@ -27033,7 +27597,7 @@
         </w:tc>
         <w:tc>
           <w:tcPr>
-            <w:tcW w:type="dxa" w:w="832"/>
+            <w:tcW w:type="dxa" w:w="786"/>
           </w:tcPr>
           <w:p>
             <w:r>
@@ -27046,7 +27610,7 @@
         </w:tc>
         <w:tc>
           <w:tcPr>
-            <w:tcW w:type="dxa" w:w="832"/>
+            <w:tcW w:type="dxa" w:w="786"/>
           </w:tcPr>
           <w:p>
             <w:r>
@@ -27059,7 +27623,7 @@
         </w:tc>
         <w:tc>
           <w:tcPr>
-            <w:tcW w:type="dxa" w:w="832"/>
+            <w:tcW w:type="dxa" w:w="786"/>
           </w:tcPr>
           <w:p>
             <w:r>
@@ -27072,7 +27636,7 @@
         </w:tc>
         <w:tc>
           <w:tcPr>
-            <w:tcW w:type="dxa" w:w="832"/>
+            <w:tcW w:type="dxa" w:w="786"/>
           </w:tcPr>
           <w:p>
             <w:r>
@@ -27085,7 +27649,7 @@
         </w:tc>
         <w:tc>
           <w:tcPr>
-            <w:tcW w:type="dxa" w:w="832"/>
+            <w:tcW w:type="dxa" w:w="786"/>
           </w:tcPr>
           <w:p>
             <w:r>
@@ -27098,7 +27662,7 @@
         </w:tc>
         <w:tc>
           <w:tcPr>
-            <w:tcW w:type="dxa" w:w="832"/>
+            <w:tcW w:type="dxa" w:w="786"/>
           </w:tcPr>
           <w:p>
             <w:r>
@@ -27111,7 +27675,7 @@
         </w:tc>
         <w:tc>
           <w:tcPr>
-            <w:tcW w:type="dxa" w:w="832"/>
+            <w:tcW w:type="dxa" w:w="786"/>
           </w:tcPr>
           <w:p>
             <w:r>
@@ -27124,7 +27688,7 @@
         </w:tc>
         <w:tc>
           <w:tcPr>
-            <w:tcW w:type="dxa" w:w="832"/>
+            <w:tcW w:type="dxa" w:w="786"/>
           </w:tcPr>
           <w:p>
             <w:r>
@@ -27137,7 +27701,7 @@
         </w:tc>
         <w:tc>
           <w:tcPr>
-            <w:tcW w:type="dxa" w:w="832"/>
+            <w:tcW w:type="dxa" w:w="786"/>
           </w:tcPr>
           <w:p>
             <w:r>
@@ -27150,7 +27714,7 @@
         </w:tc>
         <w:tc>
           <w:tcPr>
-            <w:tcW w:type="dxa" w:w="832"/>
+            <w:tcW w:type="dxa" w:w="786"/>
           </w:tcPr>
           <w:p>
             <w:r>
@@ -27163,7 +27727,7 @@
         </w:tc>
         <w:tc>
           <w:tcPr>
-            <w:tcW w:type="dxa" w:w="832"/>
+            <w:tcW w:type="dxa" w:w="786"/>
           </w:tcPr>
           <w:p>
             <w:r>
@@ -27176,20 +27740,32 @@
         </w:tc>
         <w:tc>
           <w:tcPr>
-            <w:tcW w:type="dxa" w:w="832"/>
-          </w:tcPr>
-          <w:p>
-            <w:r>
-              <w:rPr>
-                <w:sz w:val="16"/>
-              </w:rPr>
-              <w:t>1,10</w:t>
-            </w:r>
-          </w:p>
-        </w:tc>
-        <w:tc>
-          <w:tcPr>
-            <w:tcW w:type="dxa" w:w="832"/>
+            <w:tcW w:type="dxa" w:w="786"/>
+          </w:tcPr>
+          <w:p>
+            <w:r>
+              <w:rPr>
+                <w:sz w:val="16"/>
+              </w:rPr>
+              <w:t>1,12</w:t>
+            </w:r>
+          </w:p>
+        </w:tc>
+        <w:tc>
+          <w:tcPr>
+            <w:tcW w:type="dxa" w:w="786"/>
+          </w:tcPr>
+          <w:p>
+            <w:r>
+              <w:rPr>
+                <w:sz w:val="16"/>
+              </w:rPr>
+            </w:r>
+          </w:p>
+        </w:tc>
+        <w:tc>
+          <w:tcPr>
+            <w:tcW w:type="dxa" w:w="786"/>
           </w:tcPr>
           <w:p>
             <w:r>
@@ -27203,7 +27779,7 @@
       <w:tr>
         <w:tc>
           <w:tcPr>
-            <w:tcW w:type="dxa" w:w="832"/>
+            <w:tcW w:type="dxa" w:w="786"/>
           </w:tcPr>
           <w:p>
             <w:r>
@@ -27216,7 +27792,7 @@
         </w:tc>
         <w:tc>
           <w:tcPr>
-            <w:tcW w:type="dxa" w:w="832"/>
+            <w:tcW w:type="dxa" w:w="786"/>
           </w:tcPr>
           <w:p>
             <w:r>
@@ -27229,7 +27805,7 @@
         </w:tc>
         <w:tc>
           <w:tcPr>
-            <w:tcW w:type="dxa" w:w="832"/>
+            <w:tcW w:type="dxa" w:w="786"/>
           </w:tcPr>
           <w:p>
             <w:r>
@@ -27242,7 +27818,7 @@
         </w:tc>
         <w:tc>
           <w:tcPr>
-            <w:tcW w:type="dxa" w:w="832"/>
+            <w:tcW w:type="dxa" w:w="786"/>
           </w:tcPr>
           <w:p>
             <w:r>
@@ -27255,7 +27831,7 @@
         </w:tc>
         <w:tc>
           <w:tcPr>
-            <w:tcW w:type="dxa" w:w="832"/>
+            <w:tcW w:type="dxa" w:w="786"/>
           </w:tcPr>
           <w:p>
             <w:r>
@@ -27268,7 +27844,7 @@
         </w:tc>
         <w:tc>
           <w:tcPr>
-            <w:tcW w:type="dxa" w:w="832"/>
+            <w:tcW w:type="dxa" w:w="786"/>
           </w:tcPr>
           <w:p>
             <w:r>
@@ -27281,7 +27857,7 @@
         </w:tc>
         <w:tc>
           <w:tcPr>
-            <w:tcW w:type="dxa" w:w="832"/>
+            <w:tcW w:type="dxa" w:w="786"/>
           </w:tcPr>
           <w:p>
             <w:r>
@@ -27294,7 +27870,7 @@
         </w:tc>
         <w:tc>
           <w:tcPr>
-            <w:tcW w:type="dxa" w:w="832"/>
+            <w:tcW w:type="dxa" w:w="786"/>
           </w:tcPr>
           <w:p>
             <w:r>
@@ -27307,7 +27883,7 @@
         </w:tc>
         <w:tc>
           <w:tcPr>
-            <w:tcW w:type="dxa" w:w="832"/>
+            <w:tcW w:type="dxa" w:w="786"/>
           </w:tcPr>
           <w:p>
             <w:r>
@@ -27320,7 +27896,7 @@
         </w:tc>
         <w:tc>
           <w:tcPr>
-            <w:tcW w:type="dxa" w:w="832"/>
+            <w:tcW w:type="dxa" w:w="786"/>
           </w:tcPr>
           <w:p>
             <w:r>
@@ -27333,7 +27909,7 @@
         </w:tc>
         <w:tc>
           <w:tcPr>
-            <w:tcW w:type="dxa" w:w="832"/>
+            <w:tcW w:type="dxa" w:w="786"/>
           </w:tcPr>
           <w:p>
             <w:r>
@@ -27346,7 +27922,7 @@
         </w:tc>
         <w:tc>
           <w:tcPr>
-            <w:tcW w:type="dxa" w:w="832"/>
+            <w:tcW w:type="dxa" w:w="786"/>
           </w:tcPr>
           <w:p>
             <w:r>
@@ -27359,7 +27935,7 @@
         </w:tc>
         <w:tc>
           <w:tcPr>
-            <w:tcW w:type="dxa" w:w="832"/>
+            <w:tcW w:type="dxa" w:w="786"/>
           </w:tcPr>
           <w:p>
             <w:r>
@@ -27372,7 +27948,7 @@
         </w:tc>
         <w:tc>
           <w:tcPr>
-            <w:tcW w:type="dxa" w:w="832"/>
+            <w:tcW w:type="dxa" w:w="786"/>
           </w:tcPr>
           <w:p>
             <w:r>
@@ -27385,7 +27961,7 @@
         </w:tc>
         <w:tc>
           <w:tcPr>
-            <w:tcW w:type="dxa" w:w="832"/>
+            <w:tcW w:type="dxa" w:w="786"/>
           </w:tcPr>
           <w:p>
             <w:r>
@@ -27398,26 +27974,39 @@
         </w:tc>
         <w:tc>
           <w:tcPr>
-            <w:tcW w:type="dxa" w:w="832"/>
-          </w:tcPr>
-          <w:p>
-            <w:r>
-              <w:rPr>
-                <w:sz w:val="16"/>
-              </w:rPr>
-              <w:t>21,48</w:t>
-            </w:r>
-          </w:p>
-        </w:tc>
-        <w:tc>
-          <w:tcPr>
-            <w:tcW w:type="dxa" w:w="832"/>
-          </w:tcPr>
-          <w:p>
-            <w:r>
-              <w:rPr>
-                <w:sz w:val="16"/>
-              </w:rPr>
+            <w:tcW w:type="dxa" w:w="786"/>
+          </w:tcPr>
+          <w:p>
+            <w:r>
+              <w:rPr>
+                <w:sz w:val="16"/>
+              </w:rPr>
+              <w:t>21,11</w:t>
+            </w:r>
+          </w:p>
+        </w:tc>
+        <w:tc>
+          <w:tcPr>
+            <w:tcW w:type="dxa" w:w="786"/>
+          </w:tcPr>
+          <w:p>
+            <w:r>
+              <w:rPr>
+                <w:sz w:val="16"/>
+              </w:rPr>
+            </w:r>
+          </w:p>
+        </w:tc>
+        <w:tc>
+          <w:tcPr>
+            <w:tcW w:type="dxa" w:w="786"/>
+          </w:tcPr>
+          <w:p>
+            <w:r>
+              <w:rPr>
+                <w:sz w:val="16"/>
+              </w:rPr>
+              <w:t>degeneratif (klaster terbesar 95,8%; batas 90%)</w:t>
             </w:r>
           </w:p>
         </w:tc>
@@ -27425,7 +28014,7 @@
       <w:tr>
         <w:tc>
           <w:tcPr>
-            <w:tcW w:type="dxa" w:w="832"/>
+            <w:tcW w:type="dxa" w:w="786"/>
           </w:tcPr>
           <w:p>
             <w:r>
@@ -27438,7 +28027,7 @@
         </w:tc>
         <w:tc>
           <w:tcPr>
-            <w:tcW w:type="dxa" w:w="832"/>
+            <w:tcW w:type="dxa" w:w="786"/>
           </w:tcPr>
           <w:p>
             <w:r>
@@ -27451,7 +28040,7 @@
         </w:tc>
         <w:tc>
           <w:tcPr>
-            <w:tcW w:type="dxa" w:w="832"/>
+            <w:tcW w:type="dxa" w:w="786"/>
           </w:tcPr>
           <w:p>
             <w:r>
@@ -27464,7 +28053,7 @@
         </w:tc>
         <w:tc>
           <w:tcPr>
-            <w:tcW w:type="dxa" w:w="832"/>
+            <w:tcW w:type="dxa" w:w="786"/>
           </w:tcPr>
           <w:p>
             <w:r>
@@ -27477,7 +28066,7 @@
         </w:tc>
         <w:tc>
           <w:tcPr>
-            <w:tcW w:type="dxa" w:w="832"/>
+            <w:tcW w:type="dxa" w:w="786"/>
           </w:tcPr>
           <w:p>
             <w:r>
@@ -27490,7 +28079,7 @@
         </w:tc>
         <w:tc>
           <w:tcPr>
-            <w:tcW w:type="dxa" w:w="832"/>
+            <w:tcW w:type="dxa" w:w="786"/>
           </w:tcPr>
           <w:p>
             <w:r>
@@ -27503,7 +28092,7 @@
         </w:tc>
         <w:tc>
           <w:tcPr>
-            <w:tcW w:type="dxa" w:w="832"/>
+            <w:tcW w:type="dxa" w:w="786"/>
           </w:tcPr>
           <w:p>
             <w:r>
@@ -27516,7 +28105,7 @@
         </w:tc>
         <w:tc>
           <w:tcPr>
-            <w:tcW w:type="dxa" w:w="832"/>
+            <w:tcW w:type="dxa" w:w="786"/>
           </w:tcPr>
           <w:p>
             <w:r>
@@ -27529,7 +28118,7 @@
         </w:tc>
         <w:tc>
           <w:tcPr>
-            <w:tcW w:type="dxa" w:w="832"/>
+            <w:tcW w:type="dxa" w:w="786"/>
           </w:tcPr>
           <w:p>
             <w:r>
@@ -27542,7 +28131,7 @@
         </w:tc>
         <w:tc>
           <w:tcPr>
-            <w:tcW w:type="dxa" w:w="832"/>
+            <w:tcW w:type="dxa" w:w="786"/>
           </w:tcPr>
           <w:p>
             <w:r>
@@ -27555,7 +28144,7 @@
         </w:tc>
         <w:tc>
           <w:tcPr>
-            <w:tcW w:type="dxa" w:w="832"/>
+            <w:tcW w:type="dxa" w:w="786"/>
           </w:tcPr>
           <w:p>
             <w:r>
@@ -27568,7 +28157,7 @@
         </w:tc>
         <w:tc>
           <w:tcPr>
-            <w:tcW w:type="dxa" w:w="832"/>
+            <w:tcW w:type="dxa" w:w="786"/>
           </w:tcPr>
           <w:p>
             <w:r>
@@ -27581,7 +28170,7 @@
         </w:tc>
         <w:tc>
           <w:tcPr>
-            <w:tcW w:type="dxa" w:w="832"/>
+            <w:tcW w:type="dxa" w:w="786"/>
           </w:tcPr>
           <w:p>
             <w:r>
@@ -27594,7 +28183,7 @@
         </w:tc>
         <w:tc>
           <w:tcPr>
-            <w:tcW w:type="dxa" w:w="832"/>
+            <w:tcW w:type="dxa" w:w="786"/>
           </w:tcPr>
           <w:p>
             <w:r>
@@ -27607,7 +28196,7 @@
         </w:tc>
         <w:tc>
           <w:tcPr>
-            <w:tcW w:type="dxa" w:w="832"/>
+            <w:tcW w:type="dxa" w:w="786"/>
           </w:tcPr>
           <w:p>
             <w:r>
@@ -27620,20 +28209,20 @@
         </w:tc>
         <w:tc>
           <w:tcPr>
-            <w:tcW w:type="dxa" w:w="832"/>
-          </w:tcPr>
-          <w:p>
-            <w:r>
-              <w:rPr>
-                <w:sz w:val="16"/>
-              </w:rPr>
-              <w:t>2,51</w:t>
-            </w:r>
-          </w:p>
-        </w:tc>
-        <w:tc>
-          <w:tcPr>
-            <w:tcW w:type="dxa" w:w="832"/>
+            <w:tcW w:type="dxa" w:w="786"/>
+          </w:tcPr>
+          <w:p>
+            <w:r>
+              <w:rPr>
+                <w:sz w:val="16"/>
+              </w:rPr>
+              <w:t>3,25</w:t>
+            </w:r>
+          </w:p>
+        </w:tc>
+        <w:tc>
+          <w:tcPr>
+            <w:tcW w:type="dxa" w:w="786"/>
           </w:tcPr>
           <w:p>
             <w:r>
@@ -27641,6 +28230,19 @@
                 <w:sz w:val="16"/>
               </w:rPr>
               <w:t>ValueError: Islands must be larger than the quorum. If not, drop the small islands and solve for clusters in the remaining field.</w:t>
+            </w:r>
+          </w:p>
+        </w:tc>
+        <w:tc>
+          <w:tcPr>
+            <w:tcW w:type="dxa" w:w="786"/>
+          </w:tcPr>
+          <w:p>
+            <w:r>
+              <w:rPr>
+                <w:sz w:val="16"/>
+              </w:rPr>
+              <w:t>gagal dijalankan; tidak layak dibandingkan</w:t>
             </w:r>
           </w:p>
         </w:tc>

</xml_diff>